<commit_message>
docs(sisforma): format journal and docx strictly according to Sisforma 2021 template specifications
</commit_message>
<xml_diff>
--- a/Skripsi/Journal_Rafif_Arsya_Pradiva_22_N4_0014.docx
+++ b/Skripsi/Journal_Rafif_Arsya_Pradiva_22_N4_0014.docx
@@ -6,89 +6,71 @@
       <w:pPr>
         <w:pStyle w:val="Heading1"/>
         <w:keepNext/>
-        <w:spacing w:before="280" w:after="160"/>
+        <w:spacing w:before="320" w:after="160"/>
         <w:jc w:val="center"/>
       </w:pPr>
       <w:r>
-        <w:t>DESIGN AND IMPLEMENTATION OF AN INTEGRATED BOARDING HOUSE MANAGEMENT INFORMATION SYSTEM WITH PAYMENT GATEWAY: A CASE STUDY OF ASRI BOARDING HOUSE</w:t>
+        <w:rPr>
+          <w:sz w:val="30"/>
+        </w:rPr>
+        <w:t>DESIGN AND IMPLEMENTATION OF AN INTEGRATED BOARDING HOUSE MANAGEMENT INFORMATION SYSTEM WITH MIDTRANS PAYMENT GATEWAY: A CASE STUDY OF ASRI BOARDING HOUSE</w:t>
       </w:r>
     </w:p>
     <w:p>
       <w:pPr>
-        <w:spacing w:before="0" w:after="120" w:line="276" w:lineRule="auto"/>
+        <w:spacing w:before="0" w:after="40" w:line="276" w:lineRule="auto"/>
         <w:jc w:val="center"/>
       </w:pPr>
       <w:r>
         <w:rPr>
-          <w:b/>
+          <w:sz w:val="21"/>
         </w:rPr>
-        <w:t>Rafif Arsya Pradiva</w:t>
-      </w:r>
-      <w:r>
-        <w:rPr>
-          <w:vertAlign w:val="superscript"/>
-        </w:rPr>
-        <w:t>1</w:t>
-      </w:r>
-      <w:r>
-        <w:t xml:space="preserve">, </w:t>
-      </w:r>
-      <w:r>
-        <w:rPr>
-          <w:b/>
-        </w:rPr>
-        <w:t>Andre Kurniawan Pamudji</w:t>
-      </w:r>
-      <w:r>
-        <w:rPr>
-          <w:vertAlign w:val="superscript"/>
-        </w:rPr>
-        <w:t>2</w:t>
+        <w:t>1Rafif Arsya Pradiva, 2Andre Kurniawan Pamudji</w:t>
       </w:r>
     </w:p>
     <w:p>
       <w:pPr>
-        <w:spacing w:before="0" w:after="120" w:line="276" w:lineRule="auto"/>
+        <w:spacing w:before="0" w:after="40" w:line="276" w:lineRule="auto"/>
         <w:jc w:val="center"/>
       </w:pPr>
       <w:r>
-        <w:t>Department of Information Systems, Faculty of Computer Science, Universitas Katolik Soegijapranata, Semarang, Indonesia</w:t>
+        <w:rPr>
+          <w:sz w:val="21"/>
+        </w:rPr>
+        <w:t>Department of Information Systems, Faculty of Computer Science</w:t>
       </w:r>
     </w:p>
     <w:p>
       <w:pPr>
-        <w:spacing w:before="0" w:after="120" w:line="276" w:lineRule="auto"/>
+        <w:spacing w:before="0" w:after="40" w:line="276" w:lineRule="auto"/>
         <w:jc w:val="center"/>
       </w:pPr>
       <w:r>
-        <w:t xml:space="preserve">Email: </w:t>
-      </w:r>
-      <w:r>
         <w:rPr>
-          <w:vertAlign w:val="superscript"/>
+          <w:sz w:val="21"/>
         </w:rPr>
-        <w:t>1</w:t>
-      </w:r>
-      <w:r>
-        <w:t xml:space="preserve">22n40014@student.unika.ac.id, </w:t>
-      </w:r>
-      <w:r>
-        <w:rPr>
-          <w:vertAlign w:val="superscript"/>
-        </w:rPr>
-        <w:t>2</w:t>
-      </w:r>
-      <w:r>
-        <w:t>andre@unika.ac.id</w:t>
+        <w:t>Universitas Katolik Soegijapranata, Semarang, Indonesia</w:t>
       </w:r>
     </w:p>
     <w:p>
       <w:pPr>
-        <w:spacing w:before="120" w:after="120"/>
+        <w:spacing w:before="0" w:after="40" w:line="276" w:lineRule="auto"/>
+        <w:jc w:val="center"/>
       </w:pPr>
       <w:r>
         <w:rPr>
-          <w:color w:val="B4B4B4"/>
+          <w:sz w:val="21"/>
+        </w:rPr>
+        <w:t>122n40014@student.unika.ac.id, 2andre@unika.ac.id</w:t>
+      </w:r>
+    </w:p>
+    <w:p>
+      <w:pPr>
+        <w:spacing w:before="80" w:after="80"/>
+      </w:pPr>
+      <w:r>
+        <w:rPr>
+          <w:color w:val="BEBEBE"/>
           <w:sz w:val="16"/>
         </w:rPr>
         <w:t>_______________________________________________________________________________</w:t>
@@ -96,65 +78,79 @@
     </w:p>
     <w:p>
       <w:pPr>
-        <w:pStyle w:val="Heading3"/>
-        <w:keepNext/>
-        <w:spacing w:before="200" w:after="80"/>
+        <w:spacing w:before="160" w:after="80" w:line="264" w:lineRule="auto"/>
+        <w:ind w:left="288" w:right="288"/>
       </w:pPr>
       <w:r>
-        <w:t>Abstract</w:t>
+        <w:rPr>
+          <w:b/>
+          <w:i/>
+          <w:sz w:val="20"/>
+        </w:rPr>
+        <w:t xml:space="preserve">Abstract— </w:t>
       </w:r>
-    </w:p>
-    <w:p>
-      <w:pPr>
-        <w:spacing w:before="0" w:after="120" w:line="276" w:lineRule="auto"/>
-      </w:pPr>
       <w:r>
-        <w:t>Student housing operators across developing university districts frequently depend on manual paper logbooks and fragmented messaging channels. This reliance incurs persistent revenue leakage, room double-booking during peak admissions, uncoordinated debt collection, and protracted monthly reconciliation cycles. This study presents the architectural engineering and empirical deployment of an integrated boarding house management information system with automated payment processing tailored for Asri Boarding House in Tembalang, Semarang, Indonesia. Governed by the Waterfall software development life cycle, the web platform unifies Laravel 11, a 3NF-normalized MySQL 8.0 relational schema spanning 22 entities, Midtrans Snap API v2 specializing in Bank BCA Virtual Accounts, and Fonnte WhatsApp automation. Concurrency control is enforced through pessimistic row-level locking (</w:t>
+        <w:rPr>
+          <w:sz w:val="20"/>
+        </w:rPr>
+        <w:t>Student housing providers in developing university clusters frequently rely on manual ledgers and unstructured messaging, leading to revenue leakage, room double-booking during admissions, and multi-day financial reconciliation delays. This study presents the engineering and deployment of an integrated boarding house management system for Asri Boarding House, Semarang, Indonesia. Governed by the Waterfall software development life cycle, the web platform unifies Laravel 11, a 3NF-normalized MySQL 8.0 schema across 22 entities, Midtrans Snap API v2 specializing in Bank BCA Virtual Accounts, and Fonnte WhatsApp automation. Concurrency control is enforced through pessimistic row-level locking (</w:t>
       </w:r>
       <w:r>
         <w:rPr>
           <w:rFonts w:ascii="Consolas" w:hAnsi="Consolas"/>
           <w:color w:val="A02828"/>
-          <w:sz w:val="19"/>
+          <w:sz w:val="20"/>
         </w:rPr>
         <w:t>lockForUpdate()</w:t>
       </w:r>
       <w:r>
-        <w:t>) coupled with an operational post-checkout sanitation quarantine protocol. Recurring billing operates through an automated Linux cron pipeline enforcing an idempotent flat 5% calendar rollover fee and tiered legal guardian escalation. Black box testing across 60 functional scenarios demonstrated a 100% pass rate, corroborated by 510 automated PHPUnit feature tests containing 2,211 assertions. Qualitative on-site usability and think-aloud evaluation with the senior resident manager (20 years of operational tenure), validated via continuous digital audio recording (</w:t>
+        <w:rPr>
+          <w:sz w:val="20"/>
+        </w:rPr>
+        <w:t>) coupled with an operational post-checkout quarantine protocol. Automated billing operates via Linux cron schedules enforcing an idempotent flat 5% calendar rollover fee with guardian escalation. Black box testing across 60 functional scenarios achieved a 100% pass rate, corroborated by 510 automated PHPUnit feature tests comprising 2,211 assertions. On-site usability evaluation with the senior resident manager (20 years of operational tenure), validated via continuous digital audio recording (</w:t>
       </w:r>
       <w:r>
         <w:rPr>
           <w:rFonts w:ascii="Consolas" w:hAnsi="Consolas"/>
           <w:color w:val="A02828"/>
-          <w:sz w:val="19"/>
+          <w:sz w:val="20"/>
         </w:rPr>
         <w:t>REKAMAN_UX_ADMIN_KOST_2026.m4a</w:t>
       </w:r>
       <w:r>
-        <w:t>, duration 23m 14s), verified practical operational feasibility, compressing monthly financial balancing from 3–5 business days to instantaneous reporting, securing an IDR 28,500,000 monthly revenue capacity with an operational satisfaction rating of 9.5/10.</w:t>
+        <w:rPr>
+          <w:sz w:val="20"/>
+        </w:rPr>
+        <w:t>, duration 23m 14s), confirmed practical operational feasibility, compressing monthly financial balancing from 3–5 days to instant reporting with a 9.5/10 satisfaction rating.</w:t>
       </w:r>
     </w:p>
     <w:p>
       <w:pPr>
-        <w:spacing w:before="0" w:after="120" w:line="276" w:lineRule="auto"/>
+        <w:spacing w:before="80" w:after="200" w:line="264" w:lineRule="auto"/>
+        <w:ind w:left="288" w:right="288"/>
       </w:pPr>
       <w:r>
         <w:rPr>
           <w:b/>
+          <w:i/>
+          <w:sz w:val="20"/>
         </w:rPr>
-        <w:t>Keywords:</w:t>
+        <w:t xml:space="preserve">Keywords— </w:t>
       </w:r>
       <w:r>
-        <w:t xml:space="preserve"> Automated billing, Concurrency control, Laravel 11, Management information system, Payment gateway</w:t>
+        <w:rPr>
+          <w:sz w:val="20"/>
+        </w:rPr>
+        <w:t>Automated billing, Concurrency control, Laravel 11, Management information system, Payment gateway</w:t>
       </w:r>
     </w:p>
     <w:p>
       <w:pPr>
-        <w:spacing w:before="120" w:after="120"/>
+        <w:spacing w:before="80" w:after="80"/>
       </w:pPr>
       <w:r>
         <w:rPr>
-          <w:color w:val="B4B4B4"/>
+          <w:color w:val="BEBEBE"/>
           <w:sz w:val="16"/>
         </w:rPr>
         <w:t>_______________________________________________________________________________</w:t>
@@ -167,6 +163,9 @@
         <w:spacing w:before="240" w:after="120"/>
       </w:pPr>
       <w:r>
+        <w:rPr>
+          <w:sz w:val="24"/>
+        </w:rPr>
         <w:t>I. INTRODUCTION</w:t>
       </w:r>
     </w:p>
@@ -201,7 +200,7 @@
         <w:spacing w:before="0" w:after="120" w:line="276" w:lineRule="auto"/>
       </w:pPr>
       <w:r>
-        <w:t>Asri Boarding House, situated on Jl. Maera Sari, Tembalang, Semarang, exemplifies these structural vulnerabilities. The property comprises 32 rental units distributed across two floors, categorized into three distinct accommodation tiers: VIP (6 rooms priced at IDR 1,400,000 monthly), Deluxe (3 rooms at IDR 950,000 monthly), and Standard (23 rooms at IDR 750,000 monthly). At full occupancy, the facility commands a gross monthly revenue capacity of IDR 28,500,000. For over two decades, operational governance has rested upon the resident manager, Mr. Asep (48 years of age, possessing 20 years of operational experience), who maintained physical logbooks and paper carbon receipts.</w:t>
+        <w:t>Asri Boarding House, situated on Jl. Maera Sari No. 1 / No. 12, Tembalang, Semarang (Postal Code 50275), exemplifies these structural vulnerabilities. The property comprises 32 rental units distributed across two floors, categorized into three distinct accommodation tiers: VIP (6 rooms priced at IDR 1,400,000 monthly), Deluxe (3 rooms at IDR 950,000 monthly), and Standard (23 rooms at IDR 750,000 monthly). At full occupancy, the facility commands a gross monthly revenue capacity of IDR 28,500,000. For over two decades, operational governance has rested upon the resident manager, Mr. Asep (48 years of age, possessing 20 years of operational experience), who maintained physical logbooks and paper carbon receipts.</w:t>
       </w:r>
     </w:p>
     <w:p>
@@ -282,16 +281,16 @@
     </w:p>
     <w:p>
       <w:pPr>
-        <w:spacing w:before="0" w:after="120" w:line="276" w:lineRule="auto"/>
+        <w:keepNext/>
+        <w:spacing w:before="200" w:after="60"/>
+        <w:jc w:val="left"/>
       </w:pPr>
       <w:r>
         <w:rPr>
           <w:b/>
+          <w:sz w:val="20"/>
         </w:rPr>
-        <w:t>Table 1.</w:t>
-      </w:r>
-      <w:r>
-        <w:t xml:space="preserve"> Systematic Comparative Analysis of Related Works</w:t>
+        <w:t>Table 1. SYSTEMATIC COMPARATIVE ANALYSIS OF RELATED WORKS</w:t>
       </w:r>
     </w:p>
     <w:tbl>
@@ -332,6 +331,7 @@
             <w:r>
               <w:rPr>
                 <w:b/>
+                <w:sz w:val="20"/>
               </w:rPr>
               <w:t>Author &amp; Year</w:t>
             </w:r>
@@ -357,6 +357,7 @@
             <w:r>
               <w:rPr>
                 <w:b/>
+                <w:sz w:val="20"/>
               </w:rPr>
               <w:t>Methodology</w:t>
             </w:r>
@@ -382,6 +383,7 @@
             <w:r>
               <w:rPr>
                 <w:b/>
+                <w:sz w:val="20"/>
               </w:rPr>
               <w:t>Focus &amp; Architectural Scope</w:t>
             </w:r>
@@ -407,6 +409,7 @@
             <w:r>
               <w:rPr>
                 <w:b/>
+                <w:sz w:val="20"/>
               </w:rPr>
               <w:t>Research Gap Identified</w:t>
             </w:r>
@@ -433,6 +436,9 @@
             </w:pPr>
             <w:r/>
             <w:r>
+              <w:rPr>
+                <w:sz w:val="19"/>
+              </w:rPr>
               <w:t>Cornellya &amp; Afriyadi (2025) [3]</w:t>
             </w:r>
           </w:p>
@@ -453,6 +459,9 @@
             </w:pPr>
             <w:r/>
             <w:r>
+              <w:rPr>
+                <w:sz w:val="19"/>
+              </w:rPr>
               <w:t>Waterfall (SDLC)</w:t>
             </w:r>
           </w:p>
@@ -473,6 +482,9 @@
             </w:pPr>
             <w:r/>
             <w:r>
+              <w:rPr>
+                <w:sz w:val="19"/>
+              </w:rPr>
               <w:t>Laravel-based room reservation, tenant recording, and administrative reporting. Tested via black box.</w:t>
             </w:r>
           </w:p>
@@ -493,6 +505,9 @@
             </w:pPr>
             <w:r/>
             <w:r>
+              <w:rPr>
+                <w:sz w:val="19"/>
+              </w:rPr>
               <w:t>Lacks automated recurring billing schedules, late fee calculation engines, and guardian escalation.</w:t>
             </w:r>
           </w:p>
@@ -518,6 +533,9 @@
             </w:pPr>
             <w:r/>
             <w:r>
+              <w:rPr>
+                <w:sz w:val="19"/>
+              </w:rPr>
               <w:t>Nizar (2021) [4]</w:t>
             </w:r>
           </w:p>
@@ -538,6 +556,9 @@
             </w:pPr>
             <w:r/>
             <w:r>
+              <w:rPr>
+                <w:sz w:val="19"/>
+              </w:rPr>
               <w:t>Web Engineering</w:t>
             </w:r>
           </w:p>
@@ -558,6 +579,9 @@
             </w:pPr>
             <w:r/>
             <w:r>
+              <w:rPr>
+                <w:sz w:val="19"/>
+              </w:rPr>
               <w:t>E-Kost web application for accommodation catalogs and reservation inquiries.</w:t>
             </w:r>
           </w:p>
@@ -578,6 +602,9 @@
             </w:pPr>
             <w:r/>
             <w:r>
+              <w:rPr>
+                <w:sz w:val="19"/>
+              </w:rPr>
               <w:t>Omits payment gateway integration; relies on manual bank transfer slip verification; no concurrency locking.</w:t>
             </w:r>
           </w:p>
@@ -603,6 +630,9 @@
             </w:pPr>
             <w:r/>
             <w:r>
+              <w:rPr>
+                <w:sz w:val="19"/>
+              </w:rPr>
               <w:t>Jannah et al. (2020) [5]</w:t>
             </w:r>
           </w:p>
@@ -623,6 +653,9 @@
             </w:pPr>
             <w:r/>
             <w:r>
+              <w:rPr>
+                <w:sz w:val="19"/>
+              </w:rPr>
               <w:t>Prototyping</w:t>
             </w:r>
           </w:p>
@@ -643,6 +676,9 @@
             </w:pPr>
             <w:r/>
             <w:r>
+              <w:rPr>
+                <w:sz w:val="19"/>
+              </w:rPr>
               <w:t>Marketing portal for boarding house discovery and basic listing information.</w:t>
             </w:r>
           </w:p>
@@ -663,6 +699,9 @@
             </w:pPr>
             <w:r/>
             <w:r>
+              <w:rPr>
+                <w:sz w:val="19"/>
+              </w:rPr>
               <w:t>Restricted to promotional listings; completely lacks transactional billing, room state machines, and payment APIs.</w:t>
             </w:r>
           </w:p>
@@ -688,6 +727,9 @@
             </w:pPr>
             <w:r/>
             <w:r>
+              <w:rPr>
+                <w:sz w:val="19"/>
+              </w:rPr>
               <w:t>Malaikosa &amp; Mokola (2024) [10]</w:t>
             </w:r>
           </w:p>
@@ -708,6 +750,9 @@
             </w:pPr>
             <w:r/>
             <w:r>
+              <w:rPr>
+                <w:sz w:val="19"/>
+              </w:rPr>
               <w:t>RAD</w:t>
             </w:r>
           </w:p>
@@ -728,6 +773,9 @@
             </w:pPr>
             <w:r/>
             <w:r>
+              <w:rPr>
+                <w:sz w:val="19"/>
+              </w:rPr>
               <w:t>Web-based room monitoring and manual rent collection tracking.</w:t>
             </w:r>
           </w:p>
@@ -748,6 +796,9 @@
             </w:pPr>
             <w:r/>
             <w:r>
+              <w:rPr>
+                <w:sz w:val="19"/>
+              </w:rPr>
               <w:t>No hybrid walk-in/online synchronization; lacks database row locking to prevent reservation collisions.</w:t>
             </w:r>
           </w:p>
@@ -773,6 +824,9 @@
             </w:pPr>
             <w:r/>
             <w:r>
+              <w:rPr>
+                <w:sz w:val="19"/>
+              </w:rPr>
               <w:t>Purnia et al. (2021) [11]</w:t>
             </w:r>
           </w:p>
@@ -793,6 +847,9 @@
             </w:pPr>
             <w:r/>
             <w:r>
+              <w:rPr>
+                <w:sz w:val="19"/>
+              </w:rPr>
               <w:t>Prototyping</w:t>
             </w:r>
           </w:p>
@@ -813,6 +870,9 @@
             </w:pPr>
             <w:r/>
             <w:r>
+              <w:rPr>
+                <w:sz w:val="19"/>
+              </w:rPr>
               <w:t>Mobile-based marketplace for boarding house search and discovery.</w:t>
             </w:r>
           </w:p>
@@ -833,6 +893,9 @@
             </w:pPr>
             <w:r/>
             <w:r>
+              <w:rPr>
+                <w:sz w:val="19"/>
+              </w:rPr>
               <w:t>Retail-oriented directory; lacks recurring tenancy lifecycle management and multi-channel parental alerts.</w:t>
             </w:r>
           </w:p>
@@ -858,6 +921,9 @@
             </w:pPr>
             <w:r/>
             <w:r>
+              <w:rPr>
+                <w:sz w:val="19"/>
+              </w:rPr>
               <w:t>Sutisna &amp; Aziz (2025) [7]</w:t>
             </w:r>
           </w:p>
@@ -878,6 +944,9 @@
             </w:pPr>
             <w:r/>
             <w:r>
+              <w:rPr>
+                <w:sz w:val="19"/>
+              </w:rPr>
               <w:t>Waterfall</w:t>
             </w:r>
           </w:p>
@@ -898,6 +967,9 @@
             </w:pPr>
             <w:r/>
             <w:r>
+              <w:rPr>
+                <w:sz w:val="19"/>
+              </w:rPr>
               <w:t>Event equipment rental platform integrating Midtrans Snap API. Tested via GTmetrix and Sucuri.</w:t>
             </w:r>
           </w:p>
@@ -918,6 +990,9 @@
             </w:pPr>
             <w:r/>
             <w:r>
+              <w:rPr>
+                <w:sz w:val="19"/>
+              </w:rPr>
               <w:t>Transient e-commerce retail model; lacks monthly recurring billing cycles, tenancy states, and arrears escalation.</w:t>
             </w:r>
           </w:p>
@@ -943,6 +1018,9 @@
             </w:pPr>
             <w:r/>
             <w:r>
+              <w:rPr>
+                <w:sz w:val="19"/>
+              </w:rPr>
               <w:t>Fatman et al. (2023) [8]</w:t>
             </w:r>
           </w:p>
@@ -963,6 +1041,9 @@
             </w:pPr>
             <w:r/>
             <w:r>
+              <w:rPr>
+                <w:sz w:val="19"/>
+              </w:rPr>
               <w:t>Web Development</w:t>
             </w:r>
           </w:p>
@@ -983,6 +1064,9 @@
             </w:pPr>
             <w:r/>
             <w:r>
+              <w:rPr>
+                <w:sz w:val="19"/>
+              </w:rPr>
               <w:t>Midtrans payment gateway implementation for MSME retail transactions.</w:t>
             </w:r>
           </w:p>
@@ -1003,6 +1087,9 @@
             </w:pPr>
             <w:r/>
             <w:r>
+              <w:rPr>
+                <w:sz w:val="19"/>
+              </w:rPr>
               <w:t>Limited to simple point-of-sale checkout; does not model room occupancy states or long-term lease contracts.</w:t>
             </w:r>
           </w:p>
@@ -1028,6 +1115,9 @@
             </w:pPr>
             <w:r/>
             <w:r>
+              <w:rPr>
+                <w:sz w:val="19"/>
+              </w:rPr>
               <w:t>Surya Pratama (2025) [12]</w:t>
             </w:r>
           </w:p>
@@ -1048,6 +1138,9 @@
             </w:pPr>
             <w:r/>
             <w:r>
+              <w:rPr>
+                <w:sz w:val="19"/>
+              </w:rPr>
               <w:t>Prototyping</w:t>
             </w:r>
           </w:p>
@@ -1068,6 +1161,9 @@
             </w:pPr>
             <w:r/>
             <w:r>
+              <w:rPr>
+                <w:sz w:val="19"/>
+              </w:rPr>
               <w:t>ReactJS Point of Sales (POS) integration with payment gateway API.</w:t>
             </w:r>
           </w:p>
@@ -1088,6 +1184,9 @@
             </w:pPr>
             <w:r/>
             <w:r>
+              <w:rPr>
+                <w:sz w:val="19"/>
+              </w:rPr>
               <w:t>Domain mismatch; does not address room availability race conditions, calendar late fees, or tenant lifecycle.</w:t>
             </w:r>
           </w:p>
@@ -1113,6 +1212,9 @@
             </w:pPr>
             <w:r/>
             <w:r>
+              <w:rPr>
+                <w:sz w:val="19"/>
+              </w:rPr>
               <w:t>Pramita et al. (2024) [13]</w:t>
             </w:r>
           </w:p>
@@ -1133,6 +1235,9 @@
             </w:pPr>
             <w:r/>
             <w:r>
+              <w:rPr>
+                <w:sz w:val="19"/>
+              </w:rPr>
               <w:t>Agile</w:t>
             </w:r>
           </w:p>
@@ -1153,6 +1258,9 @@
             </w:pPr>
             <w:r/>
             <w:r>
+              <w:rPr>
+                <w:sz w:val="19"/>
+              </w:rPr>
               <w:t>Android-based tuition payment application using Midtrans.</w:t>
             </w:r>
           </w:p>
@@ -1173,6 +1281,9 @@
             </w:pPr>
             <w:r/>
             <w:r>
+              <w:rPr>
+                <w:sz w:val="19"/>
+              </w:rPr>
               <w:t>Education fee context; lacks room state machines, soft-delete identity preservation, and walk-in reconciliation.</w:t>
             </w:r>
           </w:p>
@@ -1198,6 +1309,9 @@
             </w:pPr>
             <w:r/>
             <w:r>
+              <w:rPr>
+                <w:sz w:val="19"/>
+              </w:rPr>
               <w:t>Hakim et al. (2021) [15]</w:t>
             </w:r>
           </w:p>
@@ -1218,6 +1332,9 @@
             </w:pPr>
             <w:r/>
             <w:r>
+              <w:rPr>
+                <w:sz w:val="19"/>
+              </w:rPr>
               <w:t>Web Development</w:t>
             </w:r>
           </w:p>
@@ -1238,6 +1355,9 @@
             </w:pPr>
             <w:r/>
             <w:r>
+              <w:rPr>
+                <w:sz w:val="19"/>
+              </w:rPr>
               <w:t>Cash flow recording system coupled with Fonnte WhatsApp gateway.</w:t>
             </w:r>
           </w:p>
@@ -1258,6 +1378,9 @@
             </w:pPr>
             <w:r/>
             <w:r>
+              <w:rPr>
+                <w:sz w:val="19"/>
+              </w:rPr>
               <w:t>Focused solely on general ledger cash; disconnected from automated billing engines and digital payment channels.</w:t>
             </w:r>
           </w:p>
@@ -1354,11 +1477,11 @@
     </w:p>
     <w:p>
       <w:pPr>
-        <w:spacing w:before="120" w:after="120"/>
+        <w:spacing w:before="80" w:after="80"/>
       </w:pPr>
       <w:r>
         <w:rPr>
-          <w:color w:val="B4B4B4"/>
+          <w:color w:val="BEBEBE"/>
           <w:sz w:val="16"/>
         </w:rPr>
         <w:t>_______________________________________________________________________________</w:t>
@@ -1371,7 +1494,10 @@
         <w:spacing w:before="240" w:after="120"/>
       </w:pPr>
       <w:r>
-        <w:t>II. METHOD</w:t>
+        <w:rPr>
+          <w:sz w:val="24"/>
+        </w:rPr>
+        <w:t>II. Method</w:t>
       </w:r>
     </w:p>
     <w:p>
@@ -1381,6 +1507,9 @@
         <w:spacing w:before="200" w:after="80"/>
       </w:pPr>
       <w:r>
+        <w:rPr>
+          <w:sz w:val="22"/>
+        </w:rPr>
         <w:t>A. Research Paradigm</w:t>
       </w:r>
     </w:p>
@@ -1399,6 +1528,9 @@
         <w:spacing w:before="200" w:after="80"/>
       </w:pPr>
       <w:r>
+        <w:rPr>
+          <w:sz w:val="22"/>
+        </w:rPr>
         <w:t>B. Data Collection and Operational Triangulation</w:t>
       </w:r>
     </w:p>
@@ -1462,6 +1594,9 @@
         <w:spacing w:before="200" w:after="80"/>
       </w:pPr>
       <w:r>
+        <w:rPr>
+          <w:sz w:val="22"/>
+        </w:rPr>
         <w:t>C. Software Architecture and Component Decoupling</w:t>
       </w:r>
     </w:p>
@@ -1523,7 +1658,7 @@
               <w:rPr>
                 <w:rFonts w:ascii="Consolas" w:hAnsi="Consolas"/>
                 <w:color w:val="282828"/>
-                <w:sz w:val="18"/>
+                <w:sz w:val="17"/>
               </w:rPr>
               <w:t>+---------------------------------------------------------------+</w:t>
               <w:br/>
@@ -1584,6 +1719,19 @@
     </w:p>
     <w:p>
       <w:pPr>
+        <w:spacing w:before="60" w:after="160"/>
+        <w:jc w:val="center"/>
+      </w:pPr>
+      <w:r>
+        <w:rPr>
+          <w:i/>
+          <w:sz w:val="19"/>
+        </w:rPr>
+        <w:t>Figure 1. Three-tier architectural decoupling and service layer topology.</w:t>
+      </w:r>
+    </w:p>
+    <w:p>
+      <w:pPr>
         <w:spacing w:before="0" w:after="120" w:line="276" w:lineRule="auto"/>
       </w:pPr>
       <w:r>
@@ -1597,6 +1745,9 @@
         <w:spacing w:before="200" w:after="80"/>
       </w:pPr>
       <w:r>
+        <w:rPr>
+          <w:sz w:val="22"/>
+        </w:rPr>
         <w:t>D. Relational Schema Engineering and Virtual Generated Columns</w:t>
       </w:r>
     </w:p>
@@ -1699,7 +1850,7 @@
               <w:rPr>
                 <w:rFonts w:ascii="Consolas" w:hAnsi="Consolas"/>
                 <w:color w:val="282828"/>
-                <w:sz w:val="18"/>
+                <w:sz w:val="17"/>
               </w:rPr>
               <w:t>// Listing 1. Implementation of Virtual Generated Columns for Soft-Delete Unicity</w:t>
               <w:br/>
@@ -1759,6 +1910,9 @@
         <w:spacing w:before="200" w:after="80"/>
       </w:pPr>
       <w:r>
+        <w:rPr>
+          <w:sz w:val="22"/>
+        </w:rPr>
         <w:t>E. Concurrency Control and Transactional Invariants</w:t>
       </w:r>
     </w:p>
@@ -1839,7 +1993,7 @@
               <w:rPr>
                 <w:rFonts w:ascii="Consolas" w:hAnsi="Consolas"/>
                 <w:color w:val="282828"/>
-                <w:sz w:val="18"/>
+                <w:sz w:val="17"/>
               </w:rPr>
               <w:t>// Listing 2. Pessimistic Locking Implementation in ReservasiService</w:t>
               <w:br/>
@@ -1914,6 +2068,9 @@
         <w:spacing w:before="200" w:after="80"/>
       </w:pPr>
       <w:r>
+        <w:rPr>
+          <w:sz w:val="22"/>
+        </w:rPr>
         <w:t>F. Autonomous Billing Pipeline and Idempotent Late Fee Algorithm</w:t>
       </w:r>
     </w:p>
@@ -2082,7 +2239,7 @@
           <w:i/>
           <w:sz w:val="22"/>
         </w:rPr>
-        <w:t>\text{Late Fee} = \begin{cases} 0.05 \times \text{Tarif Pokok}, &amp; \text{if } \text{status} = \text{'terlambat'} \land \text{nominal\_denda} = 0 \land \Delta\text{Month} \ge 1 \\ 0, &amp; \text{otherwise} \end{cases}</w:t>
+        <w:t>\text{Late Fee} = \begin{cases} 0.05 \times \text{Tarif Pokok}, &amp; \text{if } \text{status} = \text{'terlambat'} \land \text{nominal\_denda} = 0 \land \Delta\text{Month} \ge 1 \\ 0, &amp; \text{otherwise} \end{cases} \quad (1)</w:t>
       </w:r>
     </w:p>
     <w:p>
@@ -2100,6 +2257,9 @@
         <w:spacing w:before="200" w:after="80"/>
       </w:pPr>
       <w:r>
+        <w:rPr>
+          <w:sz w:val="22"/>
+        </w:rPr>
         <w:t>G. Verification Framework</w:t>
       </w:r>
     </w:p>
@@ -2184,11 +2344,11 @@
     </w:p>
     <w:p>
       <w:pPr>
-        <w:spacing w:before="120" w:after="120"/>
+        <w:spacing w:before="80" w:after="80"/>
       </w:pPr>
       <w:r>
         <w:rPr>
-          <w:color w:val="B4B4B4"/>
+          <w:color w:val="BEBEBE"/>
           <w:sz w:val="16"/>
         </w:rPr>
         <w:t>_______________________________________________________________________________</w:t>
@@ -2201,7 +2361,10 @@
         <w:spacing w:before="240" w:after="120"/>
       </w:pPr>
       <w:r>
-        <w:t>III. RESULTS AND DISCUSSION</w:t>
+        <w:rPr>
+          <w:sz w:val="24"/>
+        </w:rPr>
+        <w:t>III. Results and Discussion</w:t>
       </w:r>
     </w:p>
     <w:p>
@@ -2211,6 +2374,9 @@
         <w:spacing w:before="200" w:after="80"/>
       </w:pPr>
       <w:r>
+        <w:rPr>
+          <w:sz w:val="22"/>
+        </w:rPr>
         <w:t>A. RESULT</w:t>
       </w:r>
     </w:p>
@@ -2221,6 +2387,9 @@
         <w:spacing w:before="160" w:after="60"/>
       </w:pPr>
       <w:r>
+        <w:rPr>
+          <w:sz w:val="22"/>
+        </w:rPr>
         <w:t>1. Relational Database Cluster Topology</w:t>
       </w:r>
     </w:p>
@@ -2234,16 +2403,16 @@
     </w:p>
     <w:p>
       <w:pPr>
-        <w:spacing w:before="0" w:after="120" w:line="276" w:lineRule="auto"/>
+        <w:keepNext/>
+        <w:spacing w:before="200" w:after="60"/>
+        <w:jc w:val="left"/>
       </w:pPr>
       <w:r>
         <w:rPr>
           <w:b/>
+          <w:sz w:val="20"/>
         </w:rPr>
-        <w:t>Table 2.</w:t>
-      </w:r>
-      <w:r>
-        <w:t xml:space="preserve"> Relational Database Schema Topology (22 Normalized Entities)</w:t>
+        <w:t>Table 2. RELATIONAL DATABASE SCHEMA TOPOLOGY (22 NORMALIZED ENTITIES)</w:t>
       </w:r>
     </w:p>
     <w:tbl>
@@ -2283,6 +2452,7 @@
             <w:r>
               <w:rPr>
                 <w:b/>
+                <w:sz w:val="20"/>
               </w:rPr>
               <w:t>Functional Cluster</w:t>
             </w:r>
@@ -2308,6 +2478,7 @@
             <w:r>
               <w:rPr>
                 <w:b/>
+                <w:sz w:val="20"/>
               </w:rPr>
               <w:t>Entity Name</w:t>
             </w:r>
@@ -2333,6 +2504,7 @@
             <w:r>
               <w:rPr>
                 <w:b/>
+                <w:sz w:val="20"/>
               </w:rPr>
               <w:t>Primary Role &amp; Business Invariants</w:t>
             </w:r>
@@ -2361,6 +2533,7 @@
             <w:r>
               <w:rPr>
                 <w:b/>
+                <w:sz w:val="19"/>
               </w:rPr>
               <w:t>Identity &amp; Access</w:t>
             </w:r>
@@ -2407,6 +2580,9 @@
             </w:pPr>
             <w:r/>
             <w:r>
+              <w:rPr>
+                <w:sz w:val="19"/>
+              </w:rPr>
               <w:t>Core credentials, authentication roles, soft deletes, and virtual columns (</w:t>
             </w:r>
             <w:r>
@@ -2418,6 +2594,9 @@
               <w:t>active_email</w:t>
             </w:r>
             <w:r>
+              <w:rPr>
+                <w:sz w:val="19"/>
+              </w:rPr>
               <w:t xml:space="preserve">, </w:t>
             </w:r>
             <w:r>
@@ -2429,6 +2608,9 @@
               <w:t>active_no_hp</w:t>
             </w:r>
             <w:r>
+              <w:rPr>
+                <w:sz w:val="19"/>
+              </w:rPr>
               <w:t xml:space="preserve">, </w:t>
             </w:r>
             <w:r>
@@ -2440,6 +2622,9 @@
               <w:t>active_nik</w:t>
             </w:r>
             <w:r>
+              <w:rPr>
+                <w:sz w:val="19"/>
+              </w:rPr>
               <w:t>).</w:t>
             </w:r>
           </w:p>
@@ -2467,6 +2652,7 @@
             <w:r>
               <w:rPr>
                 <w:b/>
+                <w:sz w:val="19"/>
               </w:rPr>
               <w:t>Room Master</w:t>
             </w:r>
@@ -2513,6 +2699,9 @@
             </w:pPr>
             <w:r/>
             <w:r>
+              <w:rPr>
+                <w:sz w:val="19"/>
+              </w:rPr>
               <w:t xml:space="preserve">Unit inventory (32 rooms, 2 floors, 3 pricing tiers) with virtual unicity </w:t>
             </w:r>
             <w:r>
@@ -2524,6 +2713,9 @@
               <w:t>active_nomor_kamar</w:t>
             </w:r>
             <w:r>
+              <w:rPr>
+                <w:sz w:val="19"/>
+              </w:rPr>
               <w:t>.</w:t>
             </w:r>
           </w:p>
@@ -2591,6 +2783,9 @@
             </w:pPr>
             <w:r/>
             <w:r>
+              <w:rPr>
+                <w:sz w:val="19"/>
+              </w:rPr>
               <w:t>Catalog of internal amenities (Wi-Fi, AC, ensuite bathroom, water heater).</w:t>
             </w:r>
           </w:p>
@@ -2658,6 +2853,9 @@
             </w:pPr>
             <w:r/>
             <w:r>
+              <w:rPr>
+                <w:sz w:val="19"/>
+              </w:rPr>
               <w:t>Many-to-many associative pivot resolving room-amenity mapping (</w:t>
             </w:r>
             <w:r>
@@ -2669,6 +2867,9 @@
               <w:t>kamar_id</w:t>
             </w:r>
             <w:r>
+              <w:rPr>
+                <w:sz w:val="19"/>
+              </w:rPr>
               <w:t xml:space="preserve">, </w:t>
             </w:r>
             <w:r>
@@ -2680,6 +2881,9 @@
               <w:t>fasilitas_id</w:t>
             </w:r>
             <w:r>
+              <w:rPr>
+                <w:sz w:val="19"/>
+              </w:rPr>
               <w:t>).</w:t>
             </w:r>
           </w:p>
@@ -2707,6 +2911,7 @@
             <w:r>
               <w:rPr>
                 <w:b/>
+                <w:sz w:val="19"/>
               </w:rPr>
               <w:t>Tenancy Lifecycle</w:t>
             </w:r>
@@ -2753,6 +2958,9 @@
             </w:pPr>
             <w:r/>
             <w:r>
+              <w:rPr>
+                <w:sz w:val="19"/>
+              </w:rPr>
               <w:t>Active lease contracts, base pricing, rental duration, deposit tracking, and guardian contacts.</w:t>
             </w:r>
           </w:p>
@@ -2820,6 +3028,9 @@
             </w:pPr>
             <w:r/>
             <w:r>
+              <w:rPr>
+                <w:sz w:val="19"/>
+              </w:rPr>
               <w:t>Prospective booking documents, payment schema flags (DP 30% or 100% full), and expiration timers.</w:t>
             </w:r>
           </w:p>
@@ -2847,6 +3058,7 @@
             <w:r>
               <w:rPr>
                 <w:b/>
+                <w:sz w:val="19"/>
               </w:rPr>
               <w:t>Finance &amp; Billing</w:t>
             </w:r>
@@ -2893,6 +3105,9 @@
             </w:pPr>
             <w:r/>
             <w:r>
+              <w:rPr>
+                <w:sz w:val="19"/>
+              </w:rPr>
               <w:t>Monthly rental obligations, compound invoice numbers, due dates, and late fee markers.</w:t>
             </w:r>
           </w:p>
@@ -2960,6 +3175,9 @@
             </w:pPr>
             <w:r/>
             <w:r>
+              <w:rPr>
+                <w:sz w:val="19"/>
+              </w:rPr>
               <w:t>Transactional receipts, payment channel identifiers, settlement timestamps, and staff confirmation links.</w:t>
             </w:r>
           </w:p>
@@ -3027,6 +3245,9 @@
             </w:pPr>
             <w:r/>
             <w:r>
+              <w:rPr>
+                <w:sz w:val="19"/>
+              </w:rPr>
               <w:t>Operational expenditure records (electricity tokens, municipal water, structural maintenance).</w:t>
             </w:r>
           </w:p>
@@ -3054,6 +3275,7 @@
             <w:r>
               <w:rPr>
                 <w:b/>
+                <w:sz w:val="19"/>
               </w:rPr>
               <w:t>Communication</w:t>
             </w:r>
@@ -3100,6 +3322,9 @@
             </w:pPr>
             <w:r/>
             <w:r>
+              <w:rPr>
+                <w:sz w:val="19"/>
+              </w:rPr>
               <w:t>Live pre-payment discussion channel between pending reservation applicants and administrators.</w:t>
             </w:r>
           </w:p>
@@ -3167,6 +3392,9 @@
             </w:pPr>
             <w:r/>
             <w:r>
+              <w:rPr>
+                <w:sz w:val="19"/>
+              </w:rPr>
               <w:t>Unauthenticated public visitor discussion threads bound to browser session cookies.</w:t>
             </w:r>
           </w:p>
@@ -3234,6 +3462,9 @@
             </w:pPr>
             <w:r/>
             <w:r>
+              <w:rPr>
+                <w:sz w:val="19"/>
+              </w:rPr>
               <w:t>Inbound and outbound message payloads for unauthenticated public inquiries.</w:t>
             </w:r>
           </w:p>
@@ -3301,6 +3532,9 @@
             </w:pPr>
             <w:r/>
             <w:r>
+              <w:rPr>
+                <w:sz w:val="19"/>
+              </w:rPr>
               <w:t>Immutable audit trail of dispatched WhatsApp (Fonnte) and SMTP notifications with delivery status.</w:t>
             </w:r>
           </w:p>
@@ -3368,6 +3602,9 @@
             </w:pPr>
             <w:r/>
             <w:r>
+              <w:rPr>
+                <w:sz w:val="19"/>
+              </w:rPr>
               <w:t>Administrative broadcast announcements distributed to active residents.</w:t>
             </w:r>
           </w:p>
@@ -3435,6 +3672,9 @@
             </w:pPr>
             <w:r/>
             <w:r>
+              <w:rPr>
+                <w:sz w:val="19"/>
+              </w:rPr>
               <w:t>High-priority transactional event log and internal system audit triggers.</w:t>
             </w:r>
           </w:p>
@@ -3462,6 +3702,7 @@
             <w:r>
               <w:rPr>
                 <w:b/>
+                <w:sz w:val="19"/>
               </w:rPr>
               <w:t>Operations &amp; Content</w:t>
             </w:r>
@@ -3508,6 +3749,9 @@
             </w:pPr>
             <w:r/>
             <w:r>
+              <w:rPr>
+                <w:sz w:val="19"/>
+              </w:rPr>
               <w:t>Maintenance ticketing module capturing tenant issue descriptions and physical photographic evidence.</w:t>
             </w:r>
           </w:p>
@@ -3575,6 +3819,9 @@
             </w:pPr>
             <w:r/>
             <w:r>
+              <w:rPr>
+                <w:sz w:val="19"/>
+              </w:rPr>
               <w:t>Official residential rules and disciplinary guidelines published for tenant onboarding.</w:t>
             </w:r>
           </w:p>
@@ -3642,6 +3889,9 @@
             </w:pPr>
             <w:r/>
             <w:r>
+              <w:rPr>
+                <w:sz w:val="19"/>
+              </w:rPr>
               <w:t>Moderated resident satisfaction testimonials displayed on the public landing page.</w:t>
             </w:r>
           </w:p>
@@ -3709,6 +3959,9 @@
             </w:pPr>
             <w:r/>
             <w:r>
+              <w:rPr>
+                <w:sz w:val="19"/>
+              </w:rPr>
               <w:t>Knowledge-base entries resolving recurring inquiries from prospective tenants.</w:t>
             </w:r>
           </w:p>
@@ -3776,6 +4029,9 @@
             </w:pPr>
             <w:r/>
             <w:r>
+              <w:rPr>
+                <w:sz w:val="19"/>
+              </w:rPr>
               <w:t>Property visual assets, architectural exterior photographs, and interior room showcases.</w:t>
             </w:r>
           </w:p>
@@ -3843,6 +4099,9 @@
             </w:pPr>
             <w:r/>
             <w:r>
+              <w:rPr>
+                <w:sz w:val="19"/>
+              </w:rPr>
               <w:t>Dynamic property configuration parameters (banking details, contact numbers, promotional banners).</w:t>
             </w:r>
           </w:p>
@@ -3910,6 +4169,9 @@
             </w:pPr>
             <w:r/>
             <w:r>
+              <w:rPr>
+                <w:sz w:val="19"/>
+              </w:rPr>
               <w:t>Analytics telemetry logging user interactions with floating WhatsApp landing page controls.</w:t>
             </w:r>
           </w:p>
@@ -3928,6 +4190,9 @@
         <w:spacing w:before="160" w:after="60"/>
       </w:pPr>
       <w:r>
+        <w:rPr>
+          <w:sz w:val="22"/>
+        </w:rPr>
         <w:t>2. Hybrid Dual-Channel Booking Synchronization</w:t>
       </w:r>
     </w:p>
@@ -3987,6 +4252,9 @@
         <w:spacing w:before="160" w:after="60"/>
       </w:pPr>
       <w:r>
+        <w:rPr>
+          <w:sz w:val="22"/>
+        </w:rPr>
         <w:t>3. Cryptographic Webhook Security and Signature Matching</w:t>
       </w:r>
     </w:p>
@@ -4009,7 +4277,7 @@
           <w:i/>
           <w:sz w:val="22"/>
         </w:rPr>
-        <w:t>\text{Signature}_{\text{calc}} = \text{SHA-512}(\text{order\_id} + \text{status\_code} + \text{gross\_amount} + \text{ServerKey})</w:t>
+        <w:t>\text{Signature}_{\text{calc}} = \text{SHA-512}(\text{order\_id} + \text{status\_code} + \text{gross\_amount} + \text{ServerKey}) \quad (2)</w:t>
       </w:r>
     </w:p>
     <w:p>
@@ -4112,6 +4380,9 @@
         <w:spacing w:before="160" w:after="60"/>
       </w:pPr>
       <w:r>
+        <w:rPr>
+          <w:sz w:val="22"/>
+        </w:rPr>
         <w:t>4. Post-Checkout Operational Quarantine Protocol</w:t>
       </w:r>
     </w:p>
@@ -4193,6 +4464,9 @@
         <w:spacing w:before="160" w:after="60"/>
       </w:pPr>
       <w:r>
+        <w:rPr>
+          <w:sz w:val="22"/>
+        </w:rPr>
         <w:t>5. Zero-Server-Storage Digital Receipt Compilation</w:t>
       </w:r>
     </w:p>
@@ -4230,6 +4504,9 @@
         <w:spacing w:before="160" w:after="60"/>
       </w:pPr>
       <w:r>
+        <w:rPr>
+          <w:sz w:val="22"/>
+        </w:rPr>
         <w:t>6. Production Deployment and Security Hardening</w:t>
       </w:r>
     </w:p>
@@ -4339,15 +4616,23 @@
         <w:spacing w:before="160" w:after="60"/>
       </w:pPr>
       <w:r>
+        <w:rPr>
+          <w:sz w:val="22"/>
+        </w:rPr>
         <w:t>7. Empirical Quantitative Evaluation</w:t>
       </w:r>
     </w:p>
     <w:p>
       <w:pPr>
-        <w:spacing w:before="0" w:after="120" w:line="276" w:lineRule="auto"/>
+        <w:pStyle w:val="Heading5"/>
+        <w:keepNext/>
+        <w:spacing w:before="120" w:after="40"/>
       </w:pPr>
       <w:r>
-        <w:t>##### a) Black Box Verification Suite</w:t>
+        <w:rPr>
+          <w:sz w:val="21"/>
+        </w:rPr>
+        <w:t>a) Black Box Verification Suite</w:t>
       </w:r>
     </w:p>
     <w:p>
@@ -4360,16 +4645,16 @@
     </w:p>
     <w:p>
       <w:pPr>
-        <w:spacing w:before="0" w:after="120" w:line="276" w:lineRule="auto"/>
+        <w:keepNext/>
+        <w:spacing w:before="200" w:after="60"/>
+        <w:jc w:val="left"/>
       </w:pPr>
       <w:r>
         <w:rPr>
           <w:b/>
+          <w:sz w:val="20"/>
         </w:rPr>
-        <w:t>Table 3.</w:t>
-      </w:r>
-      <w:r>
-        <w:t xml:space="preserve"> Functional Black Box Testing Suite Matrix (60 Test Scenarios)</w:t>
+        <w:t>Table 3. FUNCTIONAL BLACK BOX TESTING SUITE MATRIX (60 TEST SCENARIOS)</w:t>
       </w:r>
     </w:p>
     <w:tbl>
@@ -4412,6 +4697,7 @@
             <w:r>
               <w:rPr>
                 <w:b/>
+                <w:sz w:val="20"/>
               </w:rPr>
               <w:t>Domain Code</w:t>
             </w:r>
@@ -4437,6 +4723,7 @@
             <w:r>
               <w:rPr>
                 <w:b/>
+                <w:sz w:val="20"/>
               </w:rPr>
               <w:t>Functional Testing Scope</w:t>
             </w:r>
@@ -4462,6 +4749,7 @@
             <w:r>
               <w:rPr>
                 <w:b/>
+                <w:sz w:val="20"/>
               </w:rPr>
               <w:t>Test Scenarios</w:t>
             </w:r>
@@ -4487,6 +4775,7 @@
             <w:r>
               <w:rPr>
                 <w:b/>
+                <w:sz w:val="20"/>
               </w:rPr>
               <w:t>Passed</w:t>
             </w:r>
@@ -4512,6 +4801,7 @@
             <w:r>
               <w:rPr>
                 <w:b/>
+                <w:sz w:val="20"/>
               </w:rPr>
               <w:t>Failed</w:t>
             </w:r>
@@ -4537,6 +4827,7 @@
             <w:r>
               <w:rPr>
                 <w:b/>
+                <w:sz w:val="20"/>
               </w:rPr>
               <w:t>Pass Rate (%)</w:t>
             </w:r>
@@ -4565,6 +4856,7 @@
             <w:r>
               <w:rPr>
                 <w:b/>
+                <w:sz w:val="19"/>
               </w:rPr>
               <w:t>DOM-01</w:t>
             </w:r>
@@ -4586,6 +4878,9 @@
             </w:pPr>
             <w:r/>
             <w:r>
+              <w:rPr>
+                <w:sz w:val="19"/>
+              </w:rPr>
               <w:t>Identity Authentication, Socialite Google OAuth, &amp; Profile Gates</w:t>
             </w:r>
           </w:p>
@@ -4606,6 +4901,9 @@
             </w:pPr>
             <w:r/>
             <w:r>
+              <w:rPr>
+                <w:sz w:val="19"/>
+              </w:rPr>
               <w:t>8</w:t>
             </w:r>
           </w:p>
@@ -4626,6 +4924,9 @@
             </w:pPr>
             <w:r/>
             <w:r>
+              <w:rPr>
+                <w:sz w:val="19"/>
+              </w:rPr>
               <w:t>8</w:t>
             </w:r>
           </w:p>
@@ -4646,6 +4947,9 @@
             </w:pPr>
             <w:r/>
             <w:r>
+              <w:rPr>
+                <w:sz w:val="19"/>
+              </w:rPr>
               <w:t>0</w:t>
             </w:r>
           </w:p>
@@ -4666,6 +4970,9 @@
             </w:pPr>
             <w:r/>
             <w:r>
+              <w:rPr>
+                <w:sz w:val="19"/>
+              </w:rPr>
               <w:t>100.0%</w:t>
             </w:r>
           </w:p>
@@ -4693,6 +5000,7 @@
             <w:r>
               <w:rPr>
                 <w:b/>
+                <w:sz w:val="19"/>
               </w:rPr>
               <w:t>DOM-02</w:t>
             </w:r>
@@ -4714,6 +5022,9 @@
             </w:pPr>
             <w:r/>
             <w:r>
+              <w:rPr>
+                <w:sz w:val="19"/>
+              </w:rPr>
               <w:t>Public Catalog, Neo-Brutalist Layout, &amp; WCAG 2.1 Touch Elements</w:t>
             </w:r>
           </w:p>
@@ -4734,6 +5045,9 @@
             </w:pPr>
             <w:r/>
             <w:r>
+              <w:rPr>
+                <w:sz w:val="19"/>
+              </w:rPr>
               <w:t>9</w:t>
             </w:r>
           </w:p>
@@ -4754,6 +5068,9 @@
             </w:pPr>
             <w:r/>
             <w:r>
+              <w:rPr>
+                <w:sz w:val="19"/>
+              </w:rPr>
               <w:t>9</w:t>
             </w:r>
           </w:p>
@@ -4774,6 +5091,9 @@
             </w:pPr>
             <w:r/>
             <w:r>
+              <w:rPr>
+                <w:sz w:val="19"/>
+              </w:rPr>
               <w:t>0</w:t>
             </w:r>
           </w:p>
@@ -4794,6 +5114,9 @@
             </w:pPr>
             <w:r/>
             <w:r>
+              <w:rPr>
+                <w:sz w:val="19"/>
+              </w:rPr>
               <w:t>100.0%</w:t>
             </w:r>
           </w:p>
@@ -4821,6 +5144,7 @@
             <w:r>
               <w:rPr>
                 <w:b/>
+                <w:sz w:val="19"/>
               </w:rPr>
               <w:t>DOM-03</w:t>
             </w:r>
@@ -4842,6 +5166,9 @@
             </w:pPr>
             <w:r/>
             <w:r>
+              <w:rPr>
+                <w:sz w:val="19"/>
+              </w:rPr>
               <w:t>5-Step Reservation Stepper, Discounting, &amp; Concurrency Locks</w:t>
             </w:r>
           </w:p>
@@ -4862,6 +5189,9 @@
             </w:pPr>
             <w:r/>
             <w:r>
+              <w:rPr>
+                <w:sz w:val="19"/>
+              </w:rPr>
               <w:t>12</w:t>
             </w:r>
           </w:p>
@@ -4882,6 +5212,9 @@
             </w:pPr>
             <w:r/>
             <w:r>
+              <w:rPr>
+                <w:sz w:val="19"/>
+              </w:rPr>
               <w:t>12</w:t>
             </w:r>
           </w:p>
@@ -4902,6 +5235,9 @@
             </w:pPr>
             <w:r/>
             <w:r>
+              <w:rPr>
+                <w:sz w:val="19"/>
+              </w:rPr>
               <w:t>0</w:t>
             </w:r>
           </w:p>
@@ -4922,6 +5258,9 @@
             </w:pPr>
             <w:r/>
             <w:r>
+              <w:rPr>
+                <w:sz w:val="19"/>
+              </w:rPr>
               <w:t>100.0%</w:t>
             </w:r>
           </w:p>
@@ -4949,6 +5288,7 @@
             <w:r>
               <w:rPr>
                 <w:b/>
+                <w:sz w:val="19"/>
               </w:rPr>
               <w:t>DOM-04</w:t>
             </w:r>
@@ -4970,6 +5310,9 @@
             </w:pPr>
             <w:r/>
             <w:r>
+              <w:rPr>
+                <w:sz w:val="19"/>
+              </w:rPr>
               <w:t>Active Resident Portal, Self-Service VA, &amp; html2pdf.js Receipts</w:t>
             </w:r>
           </w:p>
@@ -4990,6 +5333,9 @@
             </w:pPr>
             <w:r/>
             <w:r>
+              <w:rPr>
+                <w:sz w:val="19"/>
+              </w:rPr>
               <w:t>10</w:t>
             </w:r>
           </w:p>
@@ -5010,6 +5356,9 @@
             </w:pPr>
             <w:r/>
             <w:r>
+              <w:rPr>
+                <w:sz w:val="19"/>
+              </w:rPr>
               <w:t>10</w:t>
             </w:r>
           </w:p>
@@ -5030,6 +5379,9 @@
             </w:pPr>
             <w:r/>
             <w:r>
+              <w:rPr>
+                <w:sz w:val="19"/>
+              </w:rPr>
               <w:t>0</w:t>
             </w:r>
           </w:p>
@@ -5050,6 +5402,9 @@
             </w:pPr>
             <w:r/>
             <w:r>
+              <w:rPr>
+                <w:sz w:val="19"/>
+              </w:rPr>
               <w:t>100.0%</w:t>
             </w:r>
           </w:p>
@@ -5077,6 +5432,7 @@
             <w:r>
               <w:rPr>
                 <w:b/>
+                <w:sz w:val="19"/>
               </w:rPr>
               <w:t>DOM-05</w:t>
             </w:r>
@@ -5098,6 +5454,9 @@
             </w:pPr>
             <w:r/>
             <w:r>
+              <w:rPr>
+                <w:sz w:val="19"/>
+              </w:rPr>
               <w:t>Administrative Console, Walk-In Onboarding, &amp; Inspection Quarantine</w:t>
             </w:r>
           </w:p>
@@ -5118,6 +5477,9 @@
             </w:pPr>
             <w:r/>
             <w:r>
+              <w:rPr>
+                <w:sz w:val="19"/>
+              </w:rPr>
               <w:t>13</w:t>
             </w:r>
           </w:p>
@@ -5138,6 +5500,9 @@
             </w:pPr>
             <w:r/>
             <w:r>
+              <w:rPr>
+                <w:sz w:val="19"/>
+              </w:rPr>
               <w:t>13</w:t>
             </w:r>
           </w:p>
@@ -5158,6 +5523,9 @@
             </w:pPr>
             <w:r/>
             <w:r>
+              <w:rPr>
+                <w:sz w:val="19"/>
+              </w:rPr>
               <w:t>0</w:t>
             </w:r>
           </w:p>
@@ -5178,6 +5546,9 @@
             </w:pPr>
             <w:r/>
             <w:r>
+              <w:rPr>
+                <w:sz w:val="19"/>
+              </w:rPr>
               <w:t>100.0%</w:t>
             </w:r>
           </w:p>
@@ -5205,6 +5576,7 @@
             <w:r>
               <w:rPr>
                 <w:b/>
+                <w:sz w:val="19"/>
               </w:rPr>
               <w:t>DOM-06</w:t>
             </w:r>
@@ -5226,6 +5598,9 @@
             </w:pPr>
             <w:r/>
             <w:r>
+              <w:rPr>
+                <w:sz w:val="19"/>
+              </w:rPr>
               <w:t>Task Scheduler, Auto-Billing Cron, 5% Late Fees, &amp; Guardian Alerts</w:t>
             </w:r>
           </w:p>
@@ -5246,6 +5621,9 @@
             </w:pPr>
             <w:r/>
             <w:r>
+              <w:rPr>
+                <w:sz w:val="19"/>
+              </w:rPr>
               <w:t>8</w:t>
             </w:r>
           </w:p>
@@ -5266,6 +5644,9 @@
             </w:pPr>
             <w:r/>
             <w:r>
+              <w:rPr>
+                <w:sz w:val="19"/>
+              </w:rPr>
               <w:t>8</w:t>
             </w:r>
           </w:p>
@@ -5286,6 +5667,9 @@
             </w:pPr>
             <w:r/>
             <w:r>
+              <w:rPr>
+                <w:sz w:val="19"/>
+              </w:rPr>
               <w:t>0</w:t>
             </w:r>
           </w:p>
@@ -5306,6 +5690,9 @@
             </w:pPr>
             <w:r/>
             <w:r>
+              <w:rPr>
+                <w:sz w:val="19"/>
+              </w:rPr>
               <w:t>100.0%</w:t>
             </w:r>
           </w:p>
@@ -5333,6 +5720,7 @@
             <w:r>
               <w:rPr>
                 <w:b/>
+                <w:sz w:val="19"/>
               </w:rPr>
               <w:t>Total</w:t>
             </w:r>
@@ -5356,6 +5744,7 @@
             <w:r>
               <w:rPr>
                 <w:b/>
+                <w:sz w:val="19"/>
               </w:rPr>
               <w:t>Comprehensive Functional Platform Testing</w:t>
             </w:r>
@@ -5379,6 +5768,7 @@
             <w:r>
               <w:rPr>
                 <w:b/>
+                <w:sz w:val="19"/>
               </w:rPr>
               <w:t>60</w:t>
             </w:r>
@@ -5402,6 +5792,7 @@
             <w:r>
               <w:rPr>
                 <w:b/>
+                <w:sz w:val="19"/>
               </w:rPr>
               <w:t>60</w:t>
             </w:r>
@@ -5425,6 +5816,7 @@
             <w:r>
               <w:rPr>
                 <w:b/>
+                <w:sz w:val="19"/>
               </w:rPr>
               <w:t>0</w:t>
             </w:r>
@@ -5448,6 +5840,7 @@
             <w:r>
               <w:rPr>
                 <w:b/>
+                <w:sz w:val="19"/>
               </w:rPr>
               <w:t>100.0%</w:t>
             </w:r>
@@ -5470,10 +5863,15 @@
     </w:p>
     <w:p>
       <w:pPr>
-        <w:spacing w:before="0" w:after="120" w:line="276" w:lineRule="auto"/>
+        <w:pStyle w:val="Heading5"/>
+        <w:keepNext/>
+        <w:spacing w:before="120" w:after="40"/>
       </w:pPr>
       <w:r>
-        <w:t>##### b) Role-Based Access Control and IDOR Immunity</w:t>
+        <w:rPr>
+          <w:sz w:val="21"/>
+        </w:rPr>
+        <w:t>b) Role-Based Access Control and IDOR Immunity</w:t>
       </w:r>
     </w:p>
     <w:p>
@@ -5519,16 +5917,16 @@
     </w:p>
     <w:p>
       <w:pPr>
-        <w:spacing w:before="0" w:after="120" w:line="276" w:lineRule="auto"/>
+        <w:keepNext/>
+        <w:spacing w:before="200" w:after="60"/>
+        <w:jc w:val="left"/>
       </w:pPr>
       <w:r>
         <w:rPr>
           <w:b/>
+          <w:sz w:val="20"/>
         </w:rPr>
-        <w:t>Table 4.</w:t>
-      </w:r>
-      <w:r>
-        <w:t xml:space="preserve"> Security, RBAC, and IDOR Hardening Verification</w:t>
+        <w:t>Table 4. SECURITY, RBAC, AND IDOR HARDENING VERIFICATION</w:t>
       </w:r>
     </w:p>
     <w:tbl>
@@ -5571,6 +5969,7 @@
             <w:r>
               <w:rPr>
                 <w:b/>
+                <w:sz w:val="20"/>
               </w:rPr>
               <w:t>No.</w:t>
             </w:r>
@@ -5596,6 +5995,7 @@
             <w:r>
               <w:rPr>
                 <w:b/>
+                <w:sz w:val="20"/>
               </w:rPr>
               <w:t>Security Test Vector</w:t>
             </w:r>
@@ -5621,6 +6021,7 @@
             <w:r>
               <w:rPr>
                 <w:b/>
+                <w:sz w:val="20"/>
               </w:rPr>
               <w:t>Simulated Inbound Request</w:t>
             </w:r>
@@ -5646,6 +6047,7 @@
             <w:r>
               <w:rPr>
                 <w:b/>
+                <w:sz w:val="20"/>
               </w:rPr>
               <w:t>Expected System Behavior</w:t>
             </w:r>
@@ -5671,6 +6073,7 @@
             <w:r>
               <w:rPr>
                 <w:b/>
+                <w:sz w:val="20"/>
               </w:rPr>
               <w:t>Empirical Outcome</w:t>
             </w:r>
@@ -5696,6 +6099,7 @@
             <w:r>
               <w:rPr>
                 <w:b/>
+                <w:sz w:val="20"/>
               </w:rPr>
               <w:t>Status</w:t>
             </w:r>
@@ -5722,6 +6126,9 @@
             </w:pPr>
             <w:r/>
             <w:r>
+              <w:rPr>
+                <w:sz w:val="19"/>
+              </w:rPr>
               <w:t>1</w:t>
             </w:r>
           </w:p>
@@ -5742,6 +6149,9 @@
             </w:pPr>
             <w:r/>
             <w:r>
+              <w:rPr>
+                <w:sz w:val="19"/>
+              </w:rPr>
               <w:t>Unauthenticated Admin Access</w:t>
             </w:r>
           </w:p>
@@ -5762,6 +6172,9 @@
             </w:pPr>
             <w:r/>
             <w:r>
+              <w:rPr>
+                <w:sz w:val="19"/>
+              </w:rPr>
               <w:t xml:space="preserve">Anonymous visitor requests </w:t>
             </w:r>
             <w:r>
@@ -5790,6 +6203,9 @@
             </w:pPr>
             <w:r/>
             <w:r>
+              <w:rPr>
+                <w:sz w:val="19"/>
+              </w:rPr>
               <w:t xml:space="preserve">Redirect request to </w:t>
             </w:r>
             <w:r>
@@ -5818,6 +6234,9 @@
             </w:pPr>
             <w:r/>
             <w:r>
+              <w:rPr>
+                <w:sz w:val="19"/>
+              </w:rPr>
               <w:t>Redirected to administrative login</w:t>
             </w:r>
           </w:p>
@@ -5838,6 +6257,9 @@
             </w:pPr>
             <w:r/>
             <w:r>
+              <w:rPr>
+                <w:sz w:val="19"/>
+              </w:rPr>
               <w:t>Passed</w:t>
             </w:r>
           </w:p>
@@ -5863,6 +6285,9 @@
             </w:pPr>
             <w:r/>
             <w:r>
+              <w:rPr>
+                <w:sz w:val="19"/>
+              </w:rPr>
               <w:t>2</w:t>
             </w:r>
           </w:p>
@@ -5883,6 +6308,9 @@
             </w:pPr>
             <w:r/>
             <w:r>
+              <w:rPr>
+                <w:sz w:val="19"/>
+              </w:rPr>
               <w:t>Privilege Escalation by Tenant</w:t>
             </w:r>
           </w:p>
@@ -5903,6 +6331,9 @@
             </w:pPr>
             <w:r/>
             <w:r>
+              <w:rPr>
+                <w:sz w:val="19"/>
+              </w:rPr>
               <w:t xml:space="preserve">Active resident requests </w:t>
             </w:r>
             <w:r>
@@ -5931,6 +6362,9 @@
             </w:pPr>
             <w:r/>
             <w:r>
+              <w:rPr>
+                <w:sz w:val="19"/>
+              </w:rPr>
               <w:t>Deny authorization; return HTTP 403 Forbidden</w:t>
             </w:r>
           </w:p>
@@ -5951,6 +6385,9 @@
             </w:pPr>
             <w:r/>
             <w:r>
+              <w:rPr>
+                <w:sz w:val="19"/>
+              </w:rPr>
               <w:t>HTTP 403 Forbidden response</w:t>
             </w:r>
           </w:p>
@@ -5971,6 +6408,9 @@
             </w:pPr>
             <w:r/>
             <w:r>
+              <w:rPr>
+                <w:sz w:val="19"/>
+              </w:rPr>
               <w:t>Passed</w:t>
             </w:r>
           </w:p>
@@ -5996,6 +6436,9 @@
             </w:pPr>
             <w:r/>
             <w:r>
+              <w:rPr>
+                <w:sz w:val="19"/>
+              </w:rPr>
               <w:t>3</w:t>
             </w:r>
           </w:p>
@@ -6016,6 +6459,9 @@
             </w:pPr>
             <w:r/>
             <w:r>
+              <w:rPr>
+                <w:sz w:val="19"/>
+              </w:rPr>
               <w:t>Public Access to Tenant Portal</w:t>
             </w:r>
           </w:p>
@@ -6036,6 +6482,9 @@
             </w:pPr>
             <w:r/>
             <w:r>
+              <w:rPr>
+                <w:sz w:val="19"/>
+              </w:rPr>
               <w:t xml:space="preserve">Anonymous visitor requests </w:t>
             </w:r>
             <w:r>
@@ -6064,6 +6513,9 @@
             </w:pPr>
             <w:r/>
             <w:r>
+              <w:rPr>
+                <w:sz w:val="19"/>
+              </w:rPr>
               <w:t xml:space="preserve">Intercept request; redirect to </w:t>
             </w:r>
             <w:r>
@@ -6092,6 +6544,9 @@
             </w:pPr>
             <w:r/>
             <w:r>
+              <w:rPr>
+                <w:sz w:val="19"/>
+              </w:rPr>
               <w:t>Redirected to tenant login</w:t>
             </w:r>
           </w:p>
@@ -6112,6 +6567,9 @@
             </w:pPr>
             <w:r/>
             <w:r>
+              <w:rPr>
+                <w:sz w:val="19"/>
+              </w:rPr>
               <w:t>Passed</w:t>
             </w:r>
           </w:p>
@@ -6137,6 +6595,9 @@
             </w:pPr>
             <w:r/>
             <w:r>
+              <w:rPr>
+                <w:sz w:val="19"/>
+              </w:rPr>
               <w:t>4</w:t>
             </w:r>
           </w:p>
@@ -6157,6 +6618,9 @@
             </w:pPr>
             <w:r/>
             <w:r>
+              <w:rPr>
+                <w:sz w:val="19"/>
+              </w:rPr>
               <w:t>Pending Tenant Early Access</w:t>
             </w:r>
           </w:p>
@@ -6177,6 +6641,9 @@
             </w:pPr>
             <w:r/>
             <w:r>
+              <w:rPr>
+                <w:sz w:val="19"/>
+              </w:rPr>
               <w:t xml:space="preserve">Pending applicant requests </w:t>
             </w:r>
             <w:r>
@@ -6205,6 +6672,9 @@
             </w:pPr>
             <w:r/>
             <w:r>
+              <w:rPr>
+                <w:sz w:val="19"/>
+              </w:rPr>
               <w:t>Middleware blocks route; display activation modal</w:t>
             </w:r>
           </w:p>
@@ -6225,6 +6695,9 @@
             </w:pPr>
             <w:r/>
             <w:r>
+              <w:rPr>
+                <w:sz w:val="19"/>
+              </w:rPr>
               <w:t>Intercepted with activation warning</w:t>
             </w:r>
           </w:p>
@@ -6245,6 +6718,9 @@
             </w:pPr>
             <w:r/>
             <w:r>
+              <w:rPr>
+                <w:sz w:val="19"/>
+              </w:rPr>
               <w:t>Passed</w:t>
             </w:r>
           </w:p>
@@ -6270,6 +6746,9 @@
             </w:pPr>
             <w:r/>
             <w:r>
+              <w:rPr>
+                <w:sz w:val="19"/>
+              </w:rPr>
               <w:t>5</w:t>
             </w:r>
           </w:p>
@@ -6290,6 +6769,9 @@
             </w:pPr>
             <w:r/>
             <w:r>
+              <w:rPr>
+                <w:sz w:val="19"/>
+              </w:rPr>
               <w:t>IDOR Invoice Parameter Tampering</w:t>
             </w:r>
           </w:p>
@@ -6310,6 +6792,9 @@
             </w:pPr>
             <w:r/>
             <w:r>
+              <w:rPr>
+                <w:sz w:val="19"/>
+              </w:rPr>
               <w:t>Tenant A alters URL parameter to view Tenant B's invoice</w:t>
             </w:r>
           </w:p>
@@ -6330,6 +6815,9 @@
             </w:pPr>
             <w:r/>
             <w:r>
+              <w:rPr>
+                <w:sz w:val="19"/>
+              </w:rPr>
               <w:t>Scope Eloquent query to active user; return 403</w:t>
             </w:r>
           </w:p>
@@ -6350,6 +6838,9 @@
             </w:pPr>
             <w:r/>
             <w:r>
+              <w:rPr>
+                <w:sz w:val="19"/>
+              </w:rPr>
               <w:t>HTTP 403 Forbidden returned</w:t>
             </w:r>
           </w:p>
@@ -6370,6 +6861,9 @@
             </w:pPr>
             <w:r/>
             <w:r>
+              <w:rPr>
+                <w:sz w:val="19"/>
+              </w:rPr>
               <w:t>Passed</w:t>
             </w:r>
           </w:p>
@@ -6395,6 +6889,9 @@
             </w:pPr>
             <w:r/>
             <w:r>
+              <w:rPr>
+                <w:sz w:val="19"/>
+              </w:rPr>
               <w:t>6</w:t>
             </w:r>
           </w:p>
@@ -6415,6 +6912,9 @@
             </w:pPr>
             <w:r/>
             <w:r>
+              <w:rPr>
+                <w:sz w:val="19"/>
+              </w:rPr>
               <w:t>IDOR Receipt Tampering</w:t>
             </w:r>
           </w:p>
@@ -6435,6 +6935,9 @@
             </w:pPr>
             <w:r/>
             <w:r>
+              <w:rPr>
+                <w:sz w:val="19"/>
+              </w:rPr>
               <w:t>User alters transaction receipt ID in download route</w:t>
             </w:r>
           </w:p>
@@ -6455,6 +6958,9 @@
             </w:pPr>
             <w:r/>
             <w:r>
+              <w:rPr>
+                <w:sz w:val="19"/>
+              </w:rPr>
               <w:t>Validate tenant-payment relationship; return 403</w:t>
             </w:r>
           </w:p>
@@ -6475,6 +6981,9 @@
             </w:pPr>
             <w:r/>
             <w:r>
+              <w:rPr>
+                <w:sz w:val="19"/>
+              </w:rPr>
               <w:t>HTTP 403 Forbidden returned</w:t>
             </w:r>
           </w:p>
@@ -6495,6 +7004,9 @@
             </w:pPr>
             <w:r/>
             <w:r>
+              <w:rPr>
+                <w:sz w:val="19"/>
+              </w:rPr>
               <w:t>Passed</w:t>
             </w:r>
           </w:p>
@@ -6508,10 +7020,15 @@
     </w:p>
     <w:p>
       <w:pPr>
-        <w:spacing w:before="0" w:after="120" w:line="276" w:lineRule="auto"/>
+        <w:pStyle w:val="Heading5"/>
+        <w:keepNext/>
+        <w:spacing w:before="120" w:after="40"/>
       </w:pPr>
       <w:r>
-        <w:t>##### c) Midtrans BCA Virtual Account Sandbox Lifecycle Verification</w:t>
+        <w:rPr>
+          <w:sz w:val="21"/>
+        </w:rPr>
+        <w:t>c) Midtrans BCA Virtual Account Sandbox Lifecycle Verification</w:t>
       </w:r>
     </w:p>
     <w:p>
@@ -6524,16 +7041,16 @@
     </w:p>
     <w:p>
       <w:pPr>
-        <w:spacing w:before="0" w:after="120" w:line="276" w:lineRule="auto"/>
+        <w:keepNext/>
+        <w:spacing w:before="200" w:after="60"/>
+        <w:jc w:val="left"/>
       </w:pPr>
       <w:r>
         <w:rPr>
           <w:b/>
+          <w:sz w:val="20"/>
         </w:rPr>
-        <w:t>Table 5.</w:t>
-      </w:r>
-      <w:r>
-        <w:t xml:space="preserve"> Midtrans BCA Virtual Account Transaction Lifecycle Verification</w:t>
+        <w:t>Table 5. MIDTRANS BCA VIRTUAL ACCOUNT TRANSACTION LIFECYCLE VERIFICATION</w:t>
       </w:r>
     </w:p>
     <w:tbl>
@@ -6576,6 +7093,7 @@
             <w:r>
               <w:rPr>
                 <w:b/>
+                <w:sz w:val="20"/>
               </w:rPr>
               <w:t>Step</w:t>
             </w:r>
@@ -6601,6 +7119,7 @@
             <w:r>
               <w:rPr>
                 <w:b/>
+                <w:sz w:val="20"/>
               </w:rPr>
               <w:t>Lifecycle Phase</w:t>
             </w:r>
@@ -6626,6 +7145,7 @@
             <w:r>
               <w:rPr>
                 <w:b/>
+                <w:sz w:val="20"/>
               </w:rPr>
               <w:t>Inbound / Outbound Action</w:t>
             </w:r>
@@ -6651,6 +7171,7 @@
             <w:r>
               <w:rPr>
                 <w:b/>
+                <w:sz w:val="20"/>
               </w:rPr>
               <w:t>System &amp; Webhook Response</w:t>
             </w:r>
@@ -6676,6 +7197,7 @@
             <w:r>
               <w:rPr>
                 <w:b/>
+                <w:sz w:val="20"/>
               </w:rPr>
               <w:t>Transaction State</w:t>
             </w:r>
@@ -6701,6 +7223,7 @@
             <w:r>
               <w:rPr>
                 <w:b/>
+                <w:sz w:val="20"/>
               </w:rPr>
               <w:t>Result</w:t>
             </w:r>
@@ -6727,6 +7250,9 @@
             </w:pPr>
             <w:r/>
             <w:r>
+              <w:rPr>
+                <w:sz w:val="19"/>
+              </w:rPr>
               <w:t>1</w:t>
             </w:r>
           </w:p>
@@ -6747,6 +7273,9 @@
             </w:pPr>
             <w:r/>
             <w:r>
+              <w:rPr>
+                <w:sz w:val="19"/>
+              </w:rPr>
               <w:t>VA Number Issuance</w:t>
             </w:r>
           </w:p>
@@ -6767,12 +7296,21 @@
             </w:pPr>
             <w:r/>
             <w:r>
+              <w:rPr>
+                <w:sz w:val="19"/>
+              </w:rPr>
               <w:t xml:space="preserve">Tenant selects Bank Transfer </w:t>
             </w:r>
             <w:r>
+              <w:rPr>
+                <w:sz w:val="19"/>
+              </w:rPr>
               <w:t>\rightarrow</w:t>
             </w:r>
             <w:r>
+              <w:rPr>
+                <w:sz w:val="19"/>
+              </w:rPr>
               <w:t xml:space="preserve"> BCA VA</w:t>
             </w:r>
           </w:p>
@@ -6793,6 +7331,9 @@
             </w:pPr>
             <w:r/>
             <w:r>
+              <w:rPr>
+                <w:sz w:val="19"/>
+              </w:rPr>
               <w:t>Snap API returns 16-digit VA code; expiry set to 24 hours</w:t>
             </w:r>
           </w:p>
@@ -6838,6 +7379,9 @@
             </w:pPr>
             <w:r/>
             <w:r>
+              <w:rPr>
+                <w:sz w:val="19"/>
+              </w:rPr>
               <w:t>Passed</w:t>
             </w:r>
           </w:p>
@@ -6863,6 +7407,9 @@
             </w:pPr>
             <w:r/>
             <w:r>
+              <w:rPr>
+                <w:sz w:val="19"/>
+              </w:rPr>
               <w:t>2</w:t>
             </w:r>
           </w:p>
@@ -6883,6 +7430,9 @@
             </w:pPr>
             <w:r/>
             <w:r>
+              <w:rPr>
+                <w:sz w:val="19"/>
+              </w:rPr>
               <w:t>Bank Simulator Inquiry</w:t>
             </w:r>
           </w:p>
@@ -6903,6 +7453,9 @@
             </w:pPr>
             <w:r/>
             <w:r>
+              <w:rPr>
+                <w:sz w:val="19"/>
+              </w:rPr>
               <w:t>Manager inputs VA number into BCA Simulator</w:t>
             </w:r>
           </w:p>
@@ -6923,6 +7476,9 @@
             </w:pPr>
             <w:r/>
             <w:r>
+              <w:rPr>
+                <w:sz w:val="19"/>
+              </w:rPr>
               <w:t>Midtrans Cloud returns bill matching Asri Boarding House</w:t>
             </w:r>
           </w:p>
@@ -6968,6 +7524,9 @@
             </w:pPr>
             <w:r/>
             <w:r>
+              <w:rPr>
+                <w:sz w:val="19"/>
+              </w:rPr>
               <w:t>Passed</w:t>
             </w:r>
           </w:p>
@@ -6993,6 +7552,9 @@
             </w:pPr>
             <w:r/>
             <w:r>
+              <w:rPr>
+                <w:sz w:val="19"/>
+              </w:rPr>
               <w:t>3</w:t>
             </w:r>
           </w:p>
@@ -7013,6 +7575,9 @@
             </w:pPr>
             <w:r/>
             <w:r>
+              <w:rPr>
+                <w:sz w:val="19"/>
+              </w:rPr>
               <w:t>Payment Settlement</w:t>
             </w:r>
           </w:p>
@@ -7033,6 +7598,9 @@
             </w:pPr>
             <w:r/>
             <w:r>
+              <w:rPr>
+                <w:sz w:val="19"/>
+              </w:rPr>
               <w:t>User triggers payment on BCA Simulator</w:t>
             </w:r>
           </w:p>
@@ -7053,6 +7621,9 @@
             </w:pPr>
             <w:r/>
             <w:r>
+              <w:rPr>
+                <w:sz w:val="19"/>
+              </w:rPr>
               <w:t>Webhook dispatches; SHA-512 validated; invoice settled</w:t>
             </w:r>
           </w:p>
@@ -7098,6 +7669,9 @@
             </w:pPr>
             <w:r/>
             <w:r>
+              <w:rPr>
+                <w:sz w:val="19"/>
+              </w:rPr>
               <w:t>Passed</w:t>
             </w:r>
           </w:p>
@@ -7123,6 +7697,9 @@
             </w:pPr>
             <w:r/>
             <w:r>
+              <w:rPr>
+                <w:sz w:val="19"/>
+              </w:rPr>
               <w:t>4</w:t>
             </w:r>
           </w:p>
@@ -7143,6 +7720,9 @@
             </w:pPr>
             <w:r/>
             <w:r>
+              <w:rPr>
+                <w:sz w:val="19"/>
+              </w:rPr>
               <w:t>Payment Expiration</w:t>
             </w:r>
           </w:p>
@@ -7163,6 +7743,9 @@
             </w:pPr>
             <w:r/>
             <w:r>
+              <w:rPr>
+                <w:sz w:val="19"/>
+              </w:rPr>
               <w:t>24-hour settlement window elapses</w:t>
             </w:r>
           </w:p>
@@ -7183,6 +7766,9 @@
             </w:pPr>
             <w:r/>
             <w:r>
+              <w:rPr>
+                <w:sz w:val="19"/>
+              </w:rPr>
               <w:t xml:space="preserve">Webhook dispatches </w:t>
             </w:r>
             <w:r>
@@ -7194,6 +7780,9 @@
               <w:t>expire</w:t>
             </w:r>
             <w:r>
+              <w:rPr>
+                <w:sz w:val="19"/>
+              </w:rPr>
               <w:t>; system releases reservation</w:t>
             </w:r>
           </w:p>
@@ -7239,6 +7828,9 @@
             </w:pPr>
             <w:r/>
             <w:r>
+              <w:rPr>
+                <w:sz w:val="19"/>
+              </w:rPr>
               <w:t>Passed</w:t>
             </w:r>
           </w:p>
@@ -7264,6 +7856,9 @@
             </w:pPr>
             <w:r/>
             <w:r>
+              <w:rPr>
+                <w:sz w:val="19"/>
+              </w:rPr>
               <w:t>5</w:t>
             </w:r>
           </w:p>
@@ -7284,6 +7879,9 @@
             </w:pPr>
             <w:r/>
             <w:r>
+              <w:rPr>
+                <w:sz w:val="19"/>
+              </w:rPr>
               <w:t>User Cancellation</w:t>
             </w:r>
           </w:p>
@@ -7304,6 +7902,9 @@
             </w:pPr>
             <w:r/>
             <w:r>
+              <w:rPr>
+                <w:sz w:val="19"/>
+              </w:rPr>
               <w:t>User aborts checkout on Snap UI</w:t>
             </w:r>
           </w:p>
@@ -7324,6 +7925,9 @@
             </w:pPr>
             <w:r/>
             <w:r>
+              <w:rPr>
+                <w:sz w:val="19"/>
+              </w:rPr>
               <w:t xml:space="preserve">Webhook dispatches </w:t>
             </w:r>
             <w:r>
@@ -7335,6 +7939,9 @@
               <w:t>cancel</w:t>
             </w:r>
             <w:r>
+              <w:rPr>
+                <w:sz w:val="19"/>
+              </w:rPr>
               <w:t>; reservation unheld</w:t>
             </w:r>
           </w:p>
@@ -7380,6 +7987,9 @@
             </w:pPr>
             <w:r/>
             <w:r>
+              <w:rPr>
+                <w:sz w:val="19"/>
+              </w:rPr>
               <w:t>Passed</w:t>
             </w:r>
           </w:p>
@@ -7405,6 +8015,9 @@
             </w:pPr>
             <w:r/>
             <w:r>
+              <w:rPr>
+                <w:sz w:val="19"/>
+              </w:rPr>
               <w:t>6</w:t>
             </w:r>
           </w:p>
@@ -7425,6 +8038,9 @@
             </w:pPr>
             <w:r/>
             <w:r>
+              <w:rPr>
+                <w:sz w:val="19"/>
+              </w:rPr>
               <w:t>Signature Tamper Attack</w:t>
             </w:r>
           </w:p>
@@ -7445,6 +8061,9 @@
             </w:pPr>
             <w:r/>
             <w:r>
+              <w:rPr>
+                <w:sz w:val="19"/>
+              </w:rPr>
               <w:t>Webhook delivered with forged SHA-512 signature</w:t>
             </w:r>
           </w:p>
@@ -7465,6 +8084,9 @@
             </w:pPr>
             <w:r/>
             <w:r>
+              <w:rPr>
+                <w:sz w:val="19"/>
+              </w:rPr>
               <w:t>Server detects hash mismatch; rejects with HTTP 403</w:t>
             </w:r>
           </w:p>
@@ -7485,6 +8107,9 @@
             </w:pPr>
             <w:r/>
             <w:r>
+              <w:rPr>
+                <w:sz w:val="19"/>
+              </w:rPr>
               <w:t>Discarded</w:t>
             </w:r>
           </w:p>
@@ -7505,6 +8130,9 @@
             </w:pPr>
             <w:r/>
             <w:r>
+              <w:rPr>
+                <w:sz w:val="19"/>
+              </w:rPr>
               <w:t>Passed</w:t>
             </w:r>
           </w:p>
@@ -7530,6 +8158,9 @@
             </w:pPr>
             <w:r/>
             <w:r>
+              <w:rPr>
+                <w:sz w:val="19"/>
+              </w:rPr>
               <w:t>7</w:t>
             </w:r>
           </w:p>
@@ -7550,6 +8181,9 @@
             </w:pPr>
             <w:r/>
             <w:r>
+              <w:rPr>
+                <w:sz w:val="19"/>
+              </w:rPr>
               <w:t>Duplicate Webhook Delivery</w:t>
             </w:r>
           </w:p>
@@ -7570,6 +8204,9 @@
             </w:pPr>
             <w:r/>
             <w:r>
+              <w:rPr>
+                <w:sz w:val="19"/>
+              </w:rPr>
               <w:t xml:space="preserve">Identical </w:t>
             </w:r>
             <w:r>
@@ -7581,6 +8218,9 @@
               <w:t>settlement</w:t>
             </w:r>
             <w:r>
+              <w:rPr>
+                <w:sz w:val="19"/>
+              </w:rPr>
               <w:t xml:space="preserve"> payload sent twice</w:t>
             </w:r>
           </w:p>
@@ -7601,6 +8241,9 @@
             </w:pPr>
             <w:r/>
             <w:r>
+              <w:rPr>
+                <w:sz w:val="19"/>
+              </w:rPr>
               <w:t xml:space="preserve">Lock detects </w:t>
             </w:r>
             <w:r>
@@ -7612,6 +8255,9 @@
               <w:t>lunas</w:t>
             </w:r>
             <w:r>
+              <w:rPr>
+                <w:sz w:val="19"/>
+              </w:rPr>
               <w:t xml:space="preserve"> status; second mutation bypassed</w:t>
             </w:r>
           </w:p>
@@ -7657,6 +8303,9 @@
             </w:pPr>
             <w:r/>
             <w:r>
+              <w:rPr>
+                <w:sz w:val="19"/>
+              </w:rPr>
               <w:t>Passed</w:t>
             </w:r>
           </w:p>
@@ -7675,6 +8324,9 @@
         <w:spacing w:before="160" w:after="60"/>
       </w:pPr>
       <w:r>
+        <w:rPr>
+          <w:sz w:val="22"/>
+        </w:rPr>
         <w:t>8. Qualitative Usability and Acceptance Evaluation with Senior Resident Manager</w:t>
       </w:r>
     </w:p>
@@ -7718,16 +8370,16 @@
     </w:p>
     <w:p>
       <w:pPr>
-        <w:spacing w:before="0" w:after="120" w:line="276" w:lineRule="auto"/>
+        <w:keepNext/>
+        <w:spacing w:before="200" w:after="60"/>
+        <w:jc w:val="left"/>
       </w:pPr>
       <w:r>
         <w:rPr>
           <w:b/>
+          <w:sz w:val="20"/>
         </w:rPr>
-        <w:t>Table 6.</w:t>
-      </w:r>
-      <w:r>
-        <w:t xml:space="preserve"> Qualitative Usability and Operational Acceptance Matrix with Senior Resident Manager</w:t>
+        <w:t>Table 6. QUALITATIVE USABILITY AND OPERATIONAL ACCEPTANCE MATRIX WITH SENIOR RESIDENT MANAGER</w:t>
       </w:r>
     </w:p>
     <w:tbl>
@@ -7769,6 +8421,7 @@
             <w:r>
               <w:rPr>
                 <w:b/>
+                <w:sz w:val="20"/>
               </w:rPr>
               <w:t>No.</w:t>
             </w:r>
@@ -7794,6 +8447,7 @@
             <w:r>
               <w:rPr>
                 <w:b/>
+                <w:sz w:val="20"/>
               </w:rPr>
               <w:t>Evaluated Functional Module</w:t>
             </w:r>
@@ -7819,6 +8473,7 @@
             <w:r>
               <w:rPr>
                 <w:b/>
+                <w:sz w:val="20"/>
               </w:rPr>
               <w:t>Manager Assessment &amp; Verbatim Reflection (Mr. Asep)</w:t>
             </w:r>
@@ -7844,6 +8499,7 @@
             <w:r>
               <w:rPr>
                 <w:b/>
+                <w:sz w:val="20"/>
               </w:rPr>
               <w:t>Spontaneous On-Screen Reaction</w:t>
             </w:r>
@@ -7869,6 +8525,7 @@
             <w:r>
               <w:rPr>
                 <w:b/>
+                <w:sz w:val="20"/>
               </w:rPr>
               <w:t>Operational Feasibility</w:t>
             </w:r>
@@ -7895,6 +8552,9 @@
             </w:pPr>
             <w:r/>
             <w:r>
+              <w:rPr>
+                <w:sz w:val="19"/>
+              </w:rPr>
               <w:t>1</w:t>
             </w:r>
           </w:p>
@@ -7917,10 +8577,14 @@
             <w:r>
               <w:rPr>
                 <w:b/>
+                <w:sz w:val="19"/>
               </w:rPr>
               <w:t>Public Catalog</w:t>
             </w:r>
             <w:r>
+              <w:rPr>
+                <w:sz w:val="19"/>
+              </w:rPr>
               <w:t xml:space="preserve"> (</w:t>
             </w:r>
             <w:r>
@@ -7932,6 +8596,9 @@
               <w:t>weatso.id</w:t>
             </w:r>
             <w:r>
+              <w:rPr>
+                <w:sz w:val="19"/>
+              </w:rPr>
               <w:t>): Room media, typography, &amp; tariffs</w:t>
             </w:r>
           </w:p>
@@ -7952,6 +8619,9 @@
             </w:pPr>
             <w:r/>
             <w:r>
+              <w:rPr>
+                <w:sz w:val="19"/>
+              </w:rPr>
               <w:t>Prominent typography with sharp contrast; high-definition imagery; upfront pricing eliminates repetitive phone inquiries from distant parents.</w:t>
             </w:r>
           </w:p>
@@ -7972,6 +8642,9 @@
             </w:pPr>
             <w:r/>
             <w:r>
+              <w:rPr>
+                <w:sz w:val="19"/>
+              </w:rPr>
               <w:t>Enthusiastic; immediately inspected room photo details</w:t>
             </w:r>
           </w:p>
@@ -7992,6 +8665,9 @@
             </w:pPr>
             <w:r/>
             <w:r>
+              <w:rPr>
+                <w:sz w:val="19"/>
+              </w:rPr>
               <w:t>Fully Accepted</w:t>
             </w:r>
           </w:p>
@@ -8017,6 +8693,9 @@
             </w:pPr>
             <w:r/>
             <w:r>
+              <w:rPr>
+                <w:sz w:val="19"/>
+              </w:rPr>
               <w:t>2</w:t>
             </w:r>
           </w:p>
@@ -8039,10 +8718,14 @@
             <w:r>
               <w:rPr>
                 <w:b/>
+                <w:sz w:val="19"/>
               </w:rPr>
               <w:t>Floating WhatsApp CTA</w:t>
             </w:r>
             <w:r>
+              <w:rPr>
+                <w:sz w:val="19"/>
+              </w:rPr>
               <w:t>: Bottom-right persistent widget</w:t>
             </w:r>
           </w:p>
@@ -8063,6 +8746,9 @@
             </w:pPr>
             <w:r/>
             <w:r>
+              <w:rPr>
+                <w:sz w:val="19"/>
+              </w:rPr>
               <w:t>Ergonomic placement easily reachable by thumb on mobile screens; connects directly to official manager WhatsApp without latency.</w:t>
             </w:r>
           </w:p>
@@ -8083,6 +8769,9 @@
             </w:pPr>
             <w:r/>
             <w:r>
+              <w:rPr>
+                <w:sz w:val="19"/>
+              </w:rPr>
               <w:t>Instantly recognized control intent</w:t>
             </w:r>
           </w:p>
@@ -8103,6 +8792,9 @@
             </w:pPr>
             <w:r/>
             <w:r>
+              <w:rPr>
+                <w:sz w:val="19"/>
+              </w:rPr>
               <w:t>Fully Accepted</w:t>
             </w:r>
           </w:p>
@@ -8128,6 +8820,9 @@
             </w:pPr>
             <w:r/>
             <w:r>
+              <w:rPr>
+                <w:sz w:val="19"/>
+              </w:rPr>
               <w:t>3</w:t>
             </w:r>
           </w:p>
@@ -8150,10 +8845,14 @@
             <w:r>
               <w:rPr>
                 <w:b/>
+                <w:sz w:val="19"/>
               </w:rPr>
               <w:t>Admin Dashboard</w:t>
             </w:r>
             <w:r>
+              <w:rPr>
+                <w:sz w:val="19"/>
+              </w:rPr>
               <w:t xml:space="preserve"> (</w:t>
             </w:r>
             <w:r>
@@ -8165,6 +8864,9 @@
               <w:t>/admin</w:t>
             </w:r>
             <w:r>
+              <w:rPr>
+                <w:sz w:val="19"/>
+              </w:rPr>
               <w:t>): Occupancy &amp; cash flow (OLED Dark Mode)</w:t>
             </w:r>
           </w:p>
@@ -8185,6 +8887,9 @@
             </w:pPr>
             <w:r/>
             <w:r>
+              <w:rPr>
+                <w:sz w:val="19"/>
+              </w:rPr>
               <w:t>Dark palette prevents visual fatigue during prolonged shifts; automated room counters and net cash calculations eliminate manual logbook arithmetic.</w:t>
             </w:r>
           </w:p>
@@ -8205,6 +8910,9 @@
             </w:pPr>
             <w:r/>
             <w:r>
+              <w:rPr>
+                <w:sz w:val="19"/>
+              </w:rPr>
               <w:t>Readily interpreted summary metrics</w:t>
             </w:r>
           </w:p>
@@ -8225,6 +8933,9 @@
             </w:pPr>
             <w:r/>
             <w:r>
+              <w:rPr>
+                <w:sz w:val="19"/>
+              </w:rPr>
               <w:t>Fully Accepted</w:t>
             </w:r>
           </w:p>
@@ -8250,6 +8961,9 @@
             </w:pPr>
             <w:r/>
             <w:r>
+              <w:rPr>
+                <w:sz w:val="19"/>
+              </w:rPr>
               <w:t>4</w:t>
             </w:r>
           </w:p>
@@ -8272,10 +8986,14 @@
             <w:r>
               <w:rPr>
                 <w:b/>
+                <w:sz w:val="19"/>
               </w:rPr>
               <w:t>Walk-In Tenant Intake</w:t>
             </w:r>
             <w:r>
+              <w:rPr>
+                <w:sz w:val="19"/>
+              </w:rPr>
               <w:t xml:space="preserve"> (</w:t>
             </w:r>
             <w:r>
@@ -8287,6 +9005,9 @@
               <w:t>/admin/penyewa/create</w:t>
             </w:r>
             <w:r>
+              <w:rPr>
+                <w:sz w:val="19"/>
+              </w:rPr>
               <w:t>): Direct onboarding</w:t>
             </w:r>
           </w:p>
@@ -8307,6 +9028,9 @@
             </w:pPr>
             <w:r/>
             <w:r>
+              <w:rPr>
+                <w:sz w:val="19"/>
+              </w:rPr>
               <w:t>Streamlined registration layout; capturing parent/guardian phone numbers is essential for emergency escalation.</w:t>
             </w:r>
           </w:p>
@@ -8327,6 +9051,9 @@
             </w:pPr>
             <w:r/>
             <w:r>
+              <w:rPr>
+                <w:sz w:val="19"/>
+              </w:rPr>
               <w:t>Nodded in approval at concise inputs</w:t>
             </w:r>
           </w:p>
@@ -8347,6 +9074,9 @@
             </w:pPr>
             <w:r/>
             <w:r>
+              <w:rPr>
+                <w:sz w:val="19"/>
+              </w:rPr>
               <w:t>Fully Accepted</w:t>
             </w:r>
           </w:p>
@@ -8372,6 +9102,9 @@
             </w:pPr>
             <w:r/>
             <w:r>
+              <w:rPr>
+                <w:sz w:val="19"/>
+              </w:rPr>
               <w:t>5</w:t>
             </w:r>
           </w:p>
@@ -8394,10 +9127,14 @@
             <w:r>
               <w:rPr>
                 <w:b/>
+                <w:sz w:val="19"/>
               </w:rPr>
               <w:t>Invoice Management &amp; Cash Settlement</w:t>
             </w:r>
             <w:r>
+              <w:rPr>
+                <w:sz w:val="19"/>
+              </w:rPr>
               <w:t xml:space="preserve"> (</w:t>
             </w:r>
             <w:r>
@@ -8409,6 +9146,9 @@
               <w:t>/admin/tagihan</w:t>
             </w:r>
             <w:r>
+              <w:rPr>
+                <w:sz w:val="19"/>
+              </w:rPr>
               <w:t>)</w:t>
             </w:r>
           </w:p>
@@ -8429,6 +9169,9 @@
             </w:pPr>
             <w:r/>
             <w:r>
+              <w:rPr>
+                <w:sz w:val="19"/>
+              </w:rPr>
               <w:t>Single-click cash settlement immediately issues digital receipts; completely supersedes searching for carbon receipt booklets.</w:t>
             </w:r>
           </w:p>
@@ -8449,6 +9192,9 @@
             </w:pPr>
             <w:r/>
             <w:r>
+              <w:rPr>
+                <w:sz w:val="19"/>
+              </w:rPr>
               <w:t>Smiled with relief at instant PDF receipt</w:t>
             </w:r>
           </w:p>
@@ -8469,6 +9215,9 @@
             </w:pPr>
             <w:r/>
             <w:r>
+              <w:rPr>
+                <w:sz w:val="19"/>
+              </w:rPr>
               <w:t>Fully Accepted</w:t>
             </w:r>
           </w:p>
@@ -8494,6 +9243,9 @@
             </w:pPr>
             <w:r/>
             <w:r>
+              <w:rPr>
+                <w:sz w:val="19"/>
+              </w:rPr>
               <w:t>6</w:t>
             </w:r>
           </w:p>
@@ -8516,6 +9268,7 @@
             <w:r>
               <w:rPr>
                 <w:b/>
+                <w:sz w:val="19"/>
               </w:rPr>
               <w:t>5% Rollover Late Fee &amp; Post-Checkout Quarantine Hold</w:t>
             </w:r>
@@ -8537,6 +9290,9 @@
             </w:pPr>
             <w:r/>
             <w:r>
+              <w:rPr>
+                <w:sz w:val="19"/>
+              </w:rPr>
               <w:t>Calendar-month late fee matches student remittance cycles; mandatory quarantine hold preventing premature re-listing is vital for room turnover.</w:t>
             </w:r>
           </w:p>
@@ -8557,6 +9313,9 @@
             </w:pPr>
             <w:r/>
             <w:r>
+              <w:rPr>
+                <w:sz w:val="19"/>
+              </w:rPr>
               <w:t>Strongly endorsed both operational rules</w:t>
             </w:r>
           </w:p>
@@ -8577,6 +9336,9 @@
             </w:pPr>
             <w:r/>
             <w:r>
+              <w:rPr>
+                <w:sz w:val="19"/>
+              </w:rPr>
               <w:t>Fully Accepted</w:t>
             </w:r>
           </w:p>
@@ -8602,6 +9364,9 @@
             </w:pPr>
             <w:r/>
             <w:r>
+              <w:rPr>
+                <w:sz w:val="19"/>
+              </w:rPr>
               <w:t>7</w:t>
             </w:r>
           </w:p>
@@ -8624,10 +9389,14 @@
             <w:r>
               <w:rPr>
                 <w:b/>
+                <w:sz w:val="19"/>
               </w:rPr>
               <w:t>Expense Logging &amp; One-Click PDF/Excel Export</w:t>
             </w:r>
             <w:r>
+              <w:rPr>
+                <w:sz w:val="19"/>
+              </w:rPr>
               <w:t xml:space="preserve"> (</w:t>
             </w:r>
             <w:r>
@@ -8639,6 +9408,9 @@
               <w:t>/admin/laporan</w:t>
             </w:r>
             <w:r>
+              <w:rPr>
+                <w:sz w:val="19"/>
+              </w:rPr>
               <w:t>)</w:t>
             </w:r>
           </w:p>
@@ -8659,6 +9431,9 @@
             </w:pPr>
             <w:r/>
             <w:r>
+              <w:rPr>
+                <w:sz w:val="19"/>
+              </w:rPr>
               <w:t>Compresses end-of-month financial reconciliation from 3–5 business days to instant on-demand generation for property owner auditing.</w:t>
             </w:r>
           </w:p>
@@ -8679,6 +9454,9 @@
             </w:pPr>
             <w:r/>
             <w:r>
+              <w:rPr>
+                <w:sz w:val="19"/>
+              </w:rPr>
               <w:t>Highly satisfied with instant PDF download</w:t>
             </w:r>
           </w:p>
@@ -8699,6 +9477,9 @@
             </w:pPr>
             <w:r/>
             <w:r>
+              <w:rPr>
+                <w:sz w:val="19"/>
+              </w:rPr>
               <w:t>Fully Accepted</w:t>
             </w:r>
           </w:p>
@@ -8724,6 +9505,9 @@
             </w:pPr>
             <w:r/>
             <w:r>
+              <w:rPr>
+                <w:sz w:val="19"/>
+              </w:rPr>
               <w:t>8</w:t>
             </w:r>
           </w:p>
@@ -8746,10 +9530,14 @@
             <w:r>
               <w:rPr>
                 <w:b/>
+                <w:sz w:val="19"/>
               </w:rPr>
               <w:t>Tenant Portal</w:t>
             </w:r>
             <w:r>
+              <w:rPr>
+                <w:sz w:val="19"/>
+              </w:rPr>
               <w:t xml:space="preserve"> (</w:t>
             </w:r>
             <w:r>
@@ -8761,6 +9549,9 @@
               <w:t>/penyewa</w:t>
             </w:r>
             <w:r>
+              <w:rPr>
+                <w:sz w:val="19"/>
+              </w:rPr>
               <w:t>): BCA VA Settlement &amp; Digital Receipts</w:t>
             </w:r>
           </w:p>
@@ -8781,6 +9572,9 @@
             </w:pPr>
             <w:r/>
             <w:r>
+              <w:rPr>
+                <w:sz w:val="19"/>
+              </w:rPr>
               <w:t>Empowers students to settle dues digitally without visiting ATMs; transaction receipts are permanently stored in tenant profiles.</w:t>
             </w:r>
           </w:p>
@@ -8801,6 +9595,9 @@
             </w:pPr>
             <w:r/>
             <w:r>
+              <w:rPr>
+                <w:sz w:val="19"/>
+              </w:rPr>
               <w:t>Appreciated digital transaction convenience</w:t>
             </w:r>
           </w:p>
@@ -8821,6 +9618,9 @@
             </w:pPr>
             <w:r/>
             <w:r>
+              <w:rPr>
+                <w:sz w:val="19"/>
+              </w:rPr>
               <w:t>Fully Accepted</w:t>
             </w:r>
           </w:p>
@@ -8846,6 +9646,9 @@
             </w:pPr>
             <w:r/>
             <w:r>
+              <w:rPr>
+                <w:sz w:val="19"/>
+              </w:rPr>
               <w:t>9</w:t>
             </w:r>
           </w:p>
@@ -8868,10 +9671,14 @@
             <w:r>
               <w:rPr>
                 <w:b/>
+                <w:sz w:val="19"/>
               </w:rPr>
               <w:t>Photographic Maintenance Ticketing</w:t>
             </w:r>
             <w:r>
+              <w:rPr>
+                <w:sz w:val="19"/>
+              </w:rPr>
               <w:t xml:space="preserve"> (</w:t>
             </w:r>
             <w:r>
@@ -8883,6 +9690,9 @@
               <w:t>/penyewa/keluhan</w:t>
             </w:r>
             <w:r>
+              <w:rPr>
+                <w:sz w:val="19"/>
+              </w:rPr>
               <w:t>)</w:t>
             </w:r>
           </w:p>
@@ -8903,6 +9713,9 @@
             </w:pPr>
             <w:r/>
             <w:r>
+              <w:rPr>
+                <w:sz w:val="19"/>
+              </w:rPr>
               <w:t>Tenant-submitted photos of damaged infrastructure prevent unrecorded verbal complaints and streamline dispatching plumbers/electricians.</w:t>
             </w:r>
           </w:p>
@@ -8923,6 +9736,9 @@
             </w:pPr>
             <w:r/>
             <w:r>
+              <w:rPr>
+                <w:sz w:val="19"/>
+              </w:rPr>
               <w:t>Highly benefited by photographic proof</w:t>
             </w:r>
           </w:p>
@@ -8943,6 +9759,9 @@
             </w:pPr>
             <w:r/>
             <w:r>
+              <w:rPr>
+                <w:sz w:val="19"/>
+              </w:rPr>
               <w:t>Fully Accepted</w:t>
             </w:r>
           </w:p>
@@ -8968,6 +9787,9 @@
             </w:pPr>
             <w:r/>
             <w:r>
+              <w:rPr>
+                <w:sz w:val="19"/>
+              </w:rPr>
               <w:t>10</w:t>
             </w:r>
           </w:p>
@@ -8990,6 +9812,7 @@
             <w:r>
               <w:rPr>
                 <w:b/>
+                <w:sz w:val="19"/>
               </w:rPr>
               <w:t>20-Year Retrospective: Manual Ledger vs Web Platform</w:t>
             </w:r>
@@ -9011,15 +9834,22 @@
             </w:pPr>
             <w:r/>
             <w:r>
+              <w:rPr>
+                <w:sz w:val="19"/>
+              </w:rPr>
               <w:t xml:space="preserve">Operational workload is substantially lighter, immune to cash discrepancies, and transparent. </w:t>
             </w:r>
             <w:r>
               <w:rPr>
                 <w:b/>
+                <w:sz w:val="19"/>
               </w:rPr>
               <w:t>Satisfaction score: 9.5 / 10</w:t>
             </w:r>
             <w:r>
+              <w:rPr>
+                <w:sz w:val="19"/>
+              </w:rPr>
               <w:t>.</w:t>
             </w:r>
           </w:p>
@@ -9040,6 +9870,9 @@
             </w:pPr>
             <w:r/>
             <w:r>
+              <w:rPr>
+                <w:sz w:val="19"/>
+              </w:rPr>
               <w:t>Expressed high confidence and readiness</w:t>
             </w:r>
           </w:p>
@@ -9060,6 +9893,9 @@
             </w:pPr>
             <w:r/>
             <w:r>
+              <w:rPr>
+                <w:sz w:val="19"/>
+              </w:rPr>
               <w:t>Fully Accepted</w:t>
             </w:r>
           </w:p>
@@ -9098,11 +9934,24 @@
     </w:p>
     <w:p>
       <w:pPr>
-        <w:spacing w:before="120" w:after="120"/>
+        <w:spacing w:before="60" w:after="160"/>
+        <w:jc w:val="center"/>
       </w:pPr>
       <w:r>
         <w:rPr>
-          <w:color w:val="B4B4B4"/>
+          <w:i/>
+          <w:sz w:val="19"/>
+        </w:rPr>
+        <w:t>Figure 2. Side-by-side operational testing and think-aloud evaluation with senior resident manager.</w:t>
+      </w:r>
+    </w:p>
+    <w:p>
+      <w:pPr>
+        <w:spacing w:before="80" w:after="80"/>
+      </w:pPr>
+      <w:r>
+        <w:rPr>
+          <w:color w:val="BEBEBE"/>
           <w:sz w:val="16"/>
         </w:rPr>
         <w:t>_______________________________________________________________________________</w:t>
@@ -9115,6 +9964,9 @@
         <w:spacing w:before="200" w:after="80"/>
       </w:pPr>
       <w:r>
+        <w:rPr>
+          <w:sz w:val="22"/>
+        </w:rPr>
         <w:t>B. DISCUSSION</w:t>
       </w:r>
     </w:p>
@@ -9174,11 +10026,11 @@
     </w:p>
     <w:p>
       <w:pPr>
-        <w:spacing w:before="120" w:after="120"/>
+        <w:spacing w:before="80" w:after="80"/>
       </w:pPr>
       <w:r>
         <w:rPr>
-          <w:color w:val="B4B4B4"/>
+          <w:color w:val="BEBEBE"/>
           <w:sz w:val="16"/>
         </w:rPr>
         <w:t>_______________________________________________________________________________</w:t>
@@ -9191,7 +10043,10 @@
         <w:spacing w:before="240" w:after="120"/>
       </w:pPr>
       <w:r>
-        <w:t>IV. CONCLUSION</w:t>
+        <w:rPr>
+          <w:sz w:val="24"/>
+        </w:rPr>
+        <w:t>IV. Conclusion</w:t>
       </w:r>
     </w:p>
     <w:p>
@@ -9328,11 +10183,11 @@
     </w:p>
     <w:p>
       <w:pPr>
-        <w:spacing w:before="120" w:after="120"/>
+        <w:spacing w:before="80" w:after="80"/>
       </w:pPr>
       <w:r>
         <w:rPr>
-          <w:color w:val="B4B4B4"/>
+          <w:color w:val="BEBEBE"/>
           <w:sz w:val="16"/>
         </w:rPr>
         <w:t>_______________________________________________________________________________</w:t>
@@ -9345,6 +10200,9 @@
         <w:spacing w:before="240" w:after="120"/>
       </w:pPr>
       <w:r>
+        <w:rPr>
+          <w:sz w:val="24"/>
+        </w:rPr>
         <w:t>ACKNOWLEDGMENT</w:t>
       </w:r>
     </w:p>
@@ -9358,11 +10216,11 @@
     </w:p>
     <w:p>
       <w:pPr>
-        <w:spacing w:before="120" w:after="120"/>
+        <w:spacing w:before="80" w:after="80"/>
       </w:pPr>
       <w:r>
         <w:rPr>
-          <w:color w:val="B4B4B4"/>
+          <w:color w:val="BEBEBE"/>
           <w:sz w:val="16"/>
         </w:rPr>
         <w:t>_______________________________________________________________________________</w:t>
@@ -9375,6 +10233,9 @@
         <w:spacing w:before="240" w:after="120"/>
       </w:pPr>
       <w:r>
+        <w:rPr>
+          <w:sz w:val="24"/>
+        </w:rPr>
         <w:t>REFERENCES</w:t>
       </w:r>
     </w:p>

</xml_diff>